<commit_message>
Set aside Robinson and Casey (on-site in Boca Raton, FL); research refreshed for today's other picks
ZipRecruiter and the firm's own WizeHire posting put the role on-site in
Florida, which fails the location rule. It moves to Job Hunt 2026/_set-aside
and is replaced in the top five. Fresh Glassdoor/Indeed research is now on
the Marcus & Millichap, HH Global, and Guild Mortgage sheets. DAILY-RUN.md
now requires a remote claim to be confirmed before a job is built.

Co-Authored-By: Claude Opus 5.5 <noreply@anthropic.com>
Claude-Session: https://claude.ai/code/session_01VpCXqDFSAKkK8y6mKL2HCw
</commit_message>
<xml_diff>
--- a/Job Hunt 2026/2026-10-14 - Guild Mortgage Company - AI Training & Enablement Specialist/Job Description & Company Research - Guild Mortgage Company.docx
+++ b/Job Hunt 2026/2026-10-14 - Guild Mortgage Company - AI Training & Enablement Specialist/Job Description & Company Research - Guild Mortgage Company.docx
@@ -44,7 +44,7 @@
         </w:rPr>
         <w:t xml:space="preserve">APPLY:  </w:t>
       </w:r>
-      <w:hyperlink w:history="1" r:id="rId3epkgr6phn0wi8t6x5l-a">
+      <w:hyperlink w:history="1" r:id="rIde-kupxggxuvhb_20ocnhs">
         <w:r>
           <w:rPr>
             <w:rFonts w:ascii="Calibri" w:cs="Calibri" w:eastAsia="Calibri" w:hAnsi="Calibri"/>
@@ -480,7 +480,7 @@
             </w:tcBorders>
           </w:tcPr>
           <w:p>
-            <w:hyperlink w:history="1" r:id="rIdwxbmemym9_bvs85fake0y">
+            <w:hyperlink w:history="1" r:id="rId7xi7xs8jjgl4ffjukpmgd">
               <w:r>
                 <w:rPr>
                   <w:rStyle w:val="Hyperlink"/>
@@ -495,6 +495,54 @@
           </w:p>
         </w:tc>
       </w:tr>
+      <w:tr>
+        <w:tc>
+          <w:tcPr>
+            <w:tcW w:type="dxa" w:w="2700"/>
+            <w:tcBorders>
+              <w:top w:val="none"/>
+              <w:left w:val="none"/>
+              <w:bottom w:val="single" w:color="E3E3E3" w:sz="2"/>
+              <w:right w:val="none"/>
+            </w:tcBorders>
+          </w:tcPr>
+          <w:p>
+            <w:r>
+              <w:rPr>
+                <w:rFonts w:ascii="Calibri" w:cs="Calibri" w:eastAsia="Calibri" w:hAnsi="Calibri"/>
+                <w:b/>
+                <w:bCs/>
+                <w:color w:val="555555"/>
+                <w:sz w:val="21"/>
+                <w:szCs w:val="21"/>
+              </w:rPr>
+              <w:t xml:space="preserve">Location check</w:t>
+            </w:r>
+          </w:p>
+        </w:tc>
+        <w:tc>
+          <w:tcPr>
+            <w:tcW w:type="dxa" w:w="7380"/>
+            <w:tcBorders>
+              <w:top w:val="none"/>
+              <w:left w:val="none"/>
+              <w:bottom w:val="single" w:color="E3E3E3" w:sz="2"/>
+              <w:right w:val="none"/>
+            </w:tcBorders>
+          </w:tcPr>
+          <w:p>
+            <w:r>
+              <w:rPr>
+                <w:rFonts w:ascii="Calibri" w:cs="Calibri" w:eastAsia="Calibri" w:hAnsi="Calibri"/>
+                <w:color w:val="1A1A1A"/>
+                <w:sz w:val="21"/>
+                <w:szCs w:val="21"/>
+              </w:rPr>
+              <w:t xml:space="preserve">The role is posted as remote in the US on Built In and Edtech.com, so living in Mesa, AZ should work. Confirm on Guild's own careers page that Arizona is an eligible state. Guild has an Arizona presence: Indeed has Phoenix-filtered reviews, and Experience.com lists a "Guild Mortgage - The Southwest" office. One caution: Flex Index says corporate staff must be in the office 3 days a week, but that page says its own content is AI-generated and unverified. Another Guild posting says candidates outside California can be fully remote, while those near San Diego or Riverside are hybrid. Get the remote status in writing in the offer.</w:t>
+            </w:r>
+          </w:p>
+        </w:tc>
+      </w:tr>
     </w:tbl>
     <w:p>
       <w:pPr>
@@ -1869,7 +1917,7 @@
           <w:sz w:val="21"/>
           <w:szCs w:val="21"/>
         </w:rPr>
-        <w:t xml:space="preserve">Guild Mortgage Company is a mortgage banking firm that says it has been in business since 1960. This report rests on two kinds of evidence, both from Dice: the full posting for the AI Training &amp; Enablement Specialist role, and Dice's list of other Guild openings. All of those openings share one Dice employer ID (80184063), and the AI posting under that ID names Guild Mortgage Company. I could not gather any employee reviews. The web search limit for this run was used up before my first search, the Indeed connector failed with a rate-limit error (-32429), and Glassdoor and Reddit cannot be opened from here. That means I have no ratings, no review counts, no employee quotes, and nothing on teams. Layoffs, leadership turnover, return-to-office policy, and pay complaints are unchecked. The role sits in AI training and enablement, not a marketing or creative team. On paper it is a remote, US-based individual contributor job, exempt, with a posted range of $82,506 to $118,345. Since September 4, 2026, Guild has posted at least 10 tech and data roles on Dice, and every one is listed as remote.</w:t>
+        <w:t xml:space="preserve">Guild Mortgage is a retail mortgage lender based in San Diego, with branches in 49 states and DC and roughly 4,000 to 5,300 employees (estimates differ by source). In December 2025 Bayview Asset Management closed a $1.3B all-cash deal that took Guild private and delisted it from the NYSE. The executive team and brand stayed, and the CEO told staff the change should feel like a "non-event." Guild built an in-house AI assistant, GuildGPT, in 2024. It is now hiring for AI enablement, AI governance, and AI engineering roles. The AI Training &amp; Enablement Specialist role is listed as remote in the US (req AITRA018532, posted Sept 29, 2026). It builds AI workshops, labs, playbooks, and knowledge bases, and works with the AI, data, product, and IT teams. Posted pay is $82,506 to $118,345 on Edtech.com, while Built In shows a flat $118K. Employee reviews are mixed (Glassdoor 3.5, Indeed 3.4). Nearly all of them come from loan officers, processors, and branch staff. None are specific to training, L&amp;D, AI, or marketing/creative teams.</w:t>
       </w:r>
     </w:p>
     <w:p>
@@ -1895,23 +1943,55 @@
       <w:r>
         <w:rPr>
           <w:rFonts w:ascii="Calibri" w:cs="Calibri" w:eastAsia="Calibri" w:hAnsi="Calibri"/>
-          <w:color w:val="1A1A1A"/>
-          <w:sz w:val="21"/>
-          <w:szCs w:val="21"/>
-        </w:rPr>
-        <w:t xml:space="preserve">Not checked. The web search limit for this run was used up before any search ran, and Glassdoor cannot be opened from this environment. I am not reporting a rating or review count. Check Glassdoor yourself before interviewing, and filter for corporate, IT, or training roles if the site allows it.</w:t>
-      </w:r>
-    </w:p>
-    <w:p>
-      <w:pPr>
-        <w:spacing w:after="60" w:before="180"/>
-      </w:pPr>
-      <w:r>
-        <w:rPr>
-          <w:rFonts w:ascii="Calibri" w:cs="Calibri" w:eastAsia="Calibri" w:hAnsi="Calibri"/>
           <w:b/>
           <w:bCs/>
           <w:color w:val="1A1A1A"/>
+          <w:sz w:val="21"/>
+          <w:szCs w:val="21"/>
+        </w:rPr>
+        <w:t xml:space="preserve">3.5 / 5 (snapshot; Finance industry average is 3.7) (About 591-592 reviews)  </w:t>
+      </w:r>
+      <w:r>
+        <w:rPr>
+          <w:rFonts w:ascii="Calibri" w:cs="Calibri" w:eastAsia="Calibri" w:hAnsi="Calibri"/>
+          <w:color w:val="1A1A1A"/>
+          <w:sz w:val="21"/>
+          <w:szCs w:val="21"/>
+        </w:rPr>
+        <w:t xml:space="preserve">Company-wide reviews, mostly from loan officers, processors, and branch staff. None are specific to training, AI, or marketing/creative roles. About 66% would recommend Guild to a friend; other snapshots show 61% and 68%. A September 2026 snapshot rates culture at 3.7 (down 7% over the past year), work-life balance at 3.8 (down 6%), and compensation at 3.7 (down 1%). Common complaints are poor management (tagged in about 30 reviews), low pay (about 23 reviews mention low pay or commission-only loan officer roles), raises of 2-4%, overwork with mandated overtime and after-hours meetings, layoffs that come in waves, and 'antiquated proprietary technology.' Praise centers on teammates, organization, support lines, and hybrid schedules. Review dates were not always shown in search results, so some may be old.</w:t>
+      </w:r>
+      <w:r>
+        <w:rPr>
+          <w:rFonts w:ascii="Calibri" w:cs="Calibri" w:eastAsia="Calibri" w:hAnsi="Calibri"/>
+          <w:color w:val="1A1A1A"/>
+          <w:sz w:val="21"/>
+          <w:szCs w:val="21"/>
+        </w:rPr>
+        <w:t xml:space="preserve"> </w:t>
+      </w:r>
+      <w:hyperlink w:history="1" r:id="rIdwp4mibwpkoo1kzrizcd9c">
+        <w:r>
+          <w:rPr>
+            <w:rFonts w:ascii="Calibri" w:cs="Calibri" w:eastAsia="Calibri" w:hAnsi="Calibri"/>
+            <w:color w:val="1A4D8F"/>
+            <w:sz w:val="21"/>
+            <w:szCs w:val="21"/>
+            <w:u w:val="single"/>
+          </w:rPr>
+          <w:t xml:space="preserve">Source</w:t>
+        </w:r>
+      </w:hyperlink>
+    </w:p>
+    <w:p>
+      <w:pPr>
+        <w:spacing w:after="60" w:before="180"/>
+      </w:pPr>
+      <w:r>
+        <w:rPr>
+          <w:rFonts w:ascii="Calibri" w:cs="Calibri" w:eastAsia="Calibri" w:hAnsi="Calibri"/>
+          <w:b/>
+          <w:bCs/>
+          <w:color w:val="1A1A1A"/>
           <w:sz w:val="23"/>
           <w:szCs w:val="23"/>
         </w:rPr>
@@ -1925,23 +2005,55 @@
       <w:r>
         <w:rPr>
           <w:rFonts w:ascii="Calibri" w:cs="Calibri" w:eastAsia="Calibri" w:hAnsi="Calibri"/>
-          <w:color w:val="1A1A1A"/>
-          <w:sz w:val="21"/>
-          <w:szCs w:val="21"/>
-        </w:rPr>
-        <w:t xml:space="preserve">Not checked. The Indeed connector failed to connect (rate-limit error -32429), and no web search could run, so I have no Indeed company rating or reviews. Try the Indeed company page yourself, or rerun this research once the connector is working.</w:t>
-      </w:r>
-    </w:p>
-    <w:p>
-      <w:pPr>
-        <w:spacing w:after="60" w:before="180"/>
-      </w:pPr>
-      <w:r>
-        <w:rPr>
-          <w:rFonts w:ascii="Calibri" w:cs="Calibri" w:eastAsia="Calibri" w:hAnsi="Calibri"/>
           <w:b/>
           <w:bCs/>
           <w:color w:val="1A1A1A"/>
+          <w:sz w:val="21"/>
+          <w:szCs w:val="21"/>
+        </w:rPr>
+        <w:t xml:space="preserve">3.4 / 5 (based on 439 reviews, from a Phoenix-filtered page snapshot; total listed is about 440)  </w:t>
+      </w:r>
+      <w:r>
+        <w:rPr>
+          <w:rFonts w:ascii="Calibri" w:cs="Calibri" w:eastAsia="Calibri" w:hAnsi="Calibri"/>
+          <w:color w:val="1A1A1A"/>
+          <w:sz w:val="21"/>
+          <w:szCs w:val="21"/>
+        </w:rPr>
+        <w:t xml:space="preserve">Company-wide reviews, with many from loan officers (78) and loan processors (37). None are from training or AI teams. Positives: a 2026 review calls the onboarding and ongoing training 'incredible,' and others mention coaching, self-help training resources, and fair salary and bonus. Negatives: management focused on getting files out, reports of 70-hour weeks, high turnover, cliques, branch-level problems that were not fixed, and layoffs when business slows. Experience varies a lot by branch. A second Indeed listing (Guild-Mortgage) has 133 reviews tagged to management. The Indeed MCP tool failed to connect, so these figures come from search results only.</w:t>
+      </w:r>
+      <w:r>
+        <w:rPr>
+          <w:rFonts w:ascii="Calibri" w:cs="Calibri" w:eastAsia="Calibri" w:hAnsi="Calibri"/>
+          <w:color w:val="1A1A1A"/>
+          <w:sz w:val="21"/>
+          <w:szCs w:val="21"/>
+        </w:rPr>
+        <w:t xml:space="preserve"> </w:t>
+      </w:r>
+      <w:hyperlink w:history="1" r:id="rIdq5xvcm8tesnrl9uuuhyxv">
+        <w:r>
+          <w:rPr>
+            <w:rFonts w:ascii="Calibri" w:cs="Calibri" w:eastAsia="Calibri" w:hAnsi="Calibri"/>
+            <w:color w:val="1A4D8F"/>
+            <w:sz w:val="21"/>
+            <w:szCs w:val="21"/>
+            <w:u w:val="single"/>
+          </w:rPr>
+          <w:t xml:space="preserve">Source</w:t>
+        </w:r>
+      </w:hyperlink>
+    </w:p>
+    <w:p>
+      <w:pPr>
+        <w:spacing w:after="60" w:before="180"/>
+      </w:pPr>
+      <w:r>
+        <w:rPr>
+          <w:rFonts w:ascii="Calibri" w:cs="Calibri" w:eastAsia="Calibri" w:hAnsi="Calibri"/>
+          <w:b/>
+          <w:bCs/>
+          <w:color w:val="1A1A1A"/>
           <w:sz w:val="23"/>
           <w:szCs w:val="23"/>
         </w:rPr>
@@ -1950,17 +2062,29 @@
     </w:p>
     <w:p>
       <w:pPr>
-        <w:spacing w:after="100" w:line="264"/>
-      </w:pPr>
-      <w:r>
-        <w:rPr>
-          <w:rFonts w:ascii="Calibri" w:cs="Calibri" w:eastAsia="Calibri" w:hAnsi="Calibri"/>
-          <w:color w:val="1A1A1A"/>
-          <w:sz w:val="21"/>
-          <w:szCs w:val="21"/>
-        </w:rPr>
-        <w:t xml:space="preserve">Not checked. The web search limit was used up and Reddit cannot be opened from this environment, so I found no threads. I did not invent any.</w:t>
-      </w:r>
+        <w:spacing w:after="100"/>
+      </w:pPr>
+      <w:r>
+        <w:rPr>
+          <w:rFonts w:ascii="Calibri" w:cs="Calibri" w:eastAsia="Calibri" w:hAnsi="Calibri"/>
+          <w:color w:val="1A1A1A"/>
+          <w:sz w:val="21"/>
+          <w:szCs w:val="21"/>
+        </w:rPr>
+        <w:t xml:space="preserve">Reddit could not be searched for this sheet: Reddit blocks the automated search Claude uses. Open the link to read what people say there. </w:t>
+      </w:r>
+      <w:hyperlink w:history="1" r:id="rIdqotvrrpu9orpdgyneqr3p">
+        <w:r>
+          <w:rPr>
+            <w:rFonts w:ascii="Calibri" w:cs="Calibri" w:eastAsia="Calibri" w:hAnsi="Calibri"/>
+            <w:color w:val="1A4D8F"/>
+            <w:sz w:val="21"/>
+            <w:szCs w:val="21"/>
+            <w:u w:val="single"/>
+          </w:rPr>
+          <w:t xml:space="preserve">Search Reddit for Guild Mortgage Company</w:t>
+        </w:r>
+      </w:hyperlink>
     </w:p>
     <w:p>
       <w:pPr>
@@ -2013,7 +2137,7 @@
           <w:sz w:val="21"/>
           <w:szCs w:val="21"/>
         </w:rPr>
-        <w:t xml:space="preserve">The job is fully remote in the US. Dice lists it as Remote, the schedule is Monday to Friday, and travel is 5% or less.</w:t>
+        <w:t xml:space="preserve">The company is investing in AI, so this role sits in a function that is growing. Guild built GuildGPT in-house; by July 2024 nearly 2,000 employees had used it and it had answered over 20,000 questions. Guild is also hiring a Lead, AI Governance (about $109K-$157K) and AI Engineers.</w:t>
       </w:r>
       <w:r>
         <w:rPr>
@@ -2024,7 +2148,7 @@
         </w:rPr>
         <w:t xml:space="preserve"> </w:t>
       </w:r>
-      <w:hyperlink w:history="1" r:id="rIdku2ug7kmg0rfu1wgbdxjq">
+      <w:hyperlink w:history="1" r:id="rIdgbes2uugemc8-f3xf8-vw">
         <w:r>
           <w:rPr>
             <w:rFonts w:ascii="Calibri" w:cs="Calibri" w:eastAsia="Calibri" w:hAnsi="Calibri"/>
@@ -2035,25 +2159,6 @@
           <w:t xml:space="preserve">[1]</w:t>
         </w:r>
       </w:hyperlink>
-    </w:p>
-    <w:p>
-      <w:pPr>
-        <w:pStyle w:val="ListParagraph"/>
-        <w:numPr>
-          <w:ilvl w:val="0"/>
-          <w:numId w:val="2"/>
-        </w:numPr>
-        <w:spacing w:after="50" w:line="259"/>
-      </w:pPr>
-      <w:r>
-        <w:rPr>
-          <w:rFonts w:ascii="Calibri" w:cs="Calibri" w:eastAsia="Calibri" w:hAnsi="Calibri"/>
-          <w:color w:val="1A1A1A"/>
-          <w:sz w:val="21"/>
-          <w:szCs w:val="21"/>
-        </w:rPr>
-        <w:t xml:space="preserve">The pay range is published. It is an exempt role with a target salary of $82,506 to $118,345 a year.</w:t>
-      </w:r>
       <w:r>
         <w:rPr>
           <w:rFonts w:ascii="Calibri" w:cs="Calibri" w:eastAsia="Calibri" w:hAnsi="Calibri"/>
@@ -2063,7 +2168,7 @@
         </w:rPr>
         <w:t xml:space="preserve"> </w:t>
       </w:r>
-      <w:hyperlink w:history="1" r:id="rIdixrgrutnjzihfyevbc6c9">
+      <w:hyperlink w:history="1" r:id="rId_8kv8gqjipk1qmwek0joa">
         <w:r>
           <w:rPr>
             <w:rFonts w:ascii="Calibri" w:cs="Calibri" w:eastAsia="Calibri" w:hAnsi="Calibri"/>
@@ -2071,28 +2176,9 @@
             <w:sz w:val="17"/>
             <w:szCs w:val="17"/>
           </w:rPr>
-          <w:t xml:space="preserve">[1]</w:t>
-        </w:r>
-      </w:hyperlink>
-    </w:p>
-    <w:p>
-      <w:pPr>
-        <w:pStyle w:val="ListParagraph"/>
-        <w:numPr>
-          <w:ilvl w:val="0"/>
-          <w:numId w:val="2"/>
-        </w:numPr>
-        <w:spacing w:after="50" w:line="259"/>
-      </w:pPr>
-      <w:r>
-        <w:rPr>
-          <w:rFonts w:ascii="Calibri" w:cs="Calibri" w:eastAsia="Calibri" w:hAnsi="Calibri"/>
-          <w:color w:val="1A1A1A"/>
-          <w:sz w:val="21"/>
-          <w:szCs w:val="21"/>
-        </w:rPr>
-        <w:t xml:space="preserve">The posting lists a standard benefits package: medical, dental, vision, life insurance, AD&amp;D, long-term disability, and a 401(k) with employer match.</w:t>
-      </w:r>
+          <w:t xml:space="preserve">[2]</w:t>
+        </w:r>
+      </w:hyperlink>
       <w:r>
         <w:rPr>
           <w:rFonts w:ascii="Calibri" w:cs="Calibri" w:eastAsia="Calibri" w:hAnsi="Calibri"/>
@@ -2102,7 +2188,7 @@
         </w:rPr>
         <w:t xml:space="preserve"> </w:t>
       </w:r>
-      <w:hyperlink w:history="1" r:id="rIdnqf6yablhy1grwcrqa-ln">
+      <w:hyperlink w:history="1" r:id="rId3m8g6y2znn6bnp8jq9mo_">
         <w:r>
           <w:rPr>
             <w:rFonts w:ascii="Calibri" w:cs="Calibri" w:eastAsia="Calibri" w:hAnsi="Calibri"/>
@@ -2110,28 +2196,9 @@
             <w:sz w:val="17"/>
             <w:szCs w:val="17"/>
           </w:rPr>
-          <w:t xml:space="preserve">[1]</w:t>
-        </w:r>
-      </w:hyperlink>
-    </w:p>
-    <w:p>
-      <w:pPr>
-        <w:pStyle w:val="ListParagraph"/>
-        <w:numPr>
-          <w:ilvl w:val="0"/>
-          <w:numId w:val="2"/>
-        </w:numPr>
-        <w:spacing w:after="50" w:line="259"/>
-      </w:pPr>
-      <w:r>
-        <w:rPr>
-          <w:rFonts w:ascii="Calibri" w:cs="Calibri" w:eastAsia="Calibri" w:hAnsi="Calibri"/>
-          <w:color w:val="1A1A1A"/>
-          <w:sz w:val="21"/>
-          <w:szCs w:val="21"/>
-        </w:rPr>
-        <w:t xml:space="preserve">Guild is hiring for technology this fall. Since September 4, 2026, it has posted a Lead Software Engineer, Principal Integration Architect, Senior Cloud Architect, Manager of DevOps, Senior Data Analyst, Senior Data Governance Analyst, Senior System Administrator for Microsoft Platforms, and Manager of IT QA. Dice lists all of them as Remote. That points to a working remote setup for corporate tech staff and to spending on tech and data. I did not open the full descriptions for these roles.</w:t>
-      </w:r>
+          <w:t xml:space="preserve">[3]</w:t>
+        </w:r>
+      </w:hyperlink>
       <w:r>
         <w:rPr>
           <w:rFonts w:ascii="Calibri" w:cs="Calibri" w:eastAsia="Calibri" w:hAnsi="Calibri"/>
@@ -2141,7 +2208,7 @@
         </w:rPr>
         <w:t xml:space="preserve"> </w:t>
       </w:r>
-      <w:hyperlink w:history="1" r:id="rIdpnbg2-inifjyx5nlyiauo">
+      <w:hyperlink w:history="1" r:id="rIdhbrwczjswbwyhyvivuhkz">
         <w:r>
           <w:rPr>
             <w:rFonts w:ascii="Calibri" w:cs="Calibri" w:eastAsia="Calibri" w:hAnsi="Calibri"/>
@@ -2149,9 +2216,28 @@
             <w:sz w:val="17"/>
             <w:szCs w:val="17"/>
           </w:rPr>
-          <w:t xml:space="preserve">[1]</w:t>
-        </w:r>
-      </w:hyperlink>
+          <w:t xml:space="preserve">[4]</w:t>
+        </w:r>
+      </w:hyperlink>
+    </w:p>
+    <w:p>
+      <w:pPr>
+        <w:pStyle w:val="ListParagraph"/>
+        <w:numPr>
+          <w:ilvl w:val="0"/>
+          <w:numId w:val="2"/>
+        </w:numPr>
+        <w:spacing w:after="50" w:line="259"/>
+      </w:pPr>
+      <w:r>
+        <w:rPr>
+          <w:rFonts w:ascii="Calibri" w:cs="Calibri" w:eastAsia="Calibri" w:hAnsi="Calibri"/>
+          <w:color w:val="1A1A1A"/>
+          <w:sz w:val="21"/>
+          <w:szCs w:val="21"/>
+        </w:rPr>
+        <w:t xml:space="preserve">The role is remote in the US, and Guild posts other US-remote corporate roles (legal, data engineering, product). One posting says non-California candidates can be fully remote.</w:t>
+      </w:r>
       <w:r>
         <w:rPr>
           <w:rFonts w:ascii="Calibri" w:cs="Calibri" w:eastAsia="Calibri" w:hAnsi="Calibri"/>
@@ -2161,7 +2247,7 @@
         </w:rPr>
         <w:t xml:space="preserve"> </w:t>
       </w:r>
-      <w:hyperlink w:history="1" r:id="rIdq_s1kj3ho5zykvyrejgzh">
+      <w:hyperlink w:history="1" r:id="rIdtuesgxtmp0c8gchv7zgla">
         <w:r>
           <w:rPr>
             <w:rFonts w:ascii="Calibri" w:cs="Calibri" w:eastAsia="Calibri" w:hAnsi="Calibri"/>
@@ -2169,7 +2255,7 @@
             <w:sz w:val="17"/>
             <w:szCs w:val="17"/>
           </w:rPr>
-          <w:t xml:space="preserve">[2]</w:t>
+          <w:t xml:space="preserve">[1]</w:t>
         </w:r>
       </w:hyperlink>
       <w:r>
@@ -2181,7 +2267,7 @@
         </w:rPr>
         <w:t xml:space="preserve"> </w:t>
       </w:r>
-      <w:hyperlink w:history="1" r:id="rIdd2-fxw0wbv-7bbzjgzuef">
+      <w:hyperlink w:history="1" r:id="rIdh4nftfmhlxyoybxfmuhsq">
         <w:r>
           <w:rPr>
             <w:rFonts w:ascii="Calibri" w:cs="Calibri" w:eastAsia="Calibri" w:hAnsi="Calibri"/>
@@ -2189,7 +2275,7 @@
             <w:sz w:val="17"/>
             <w:szCs w:val="17"/>
           </w:rPr>
-          <w:t xml:space="preserve">[3]</w:t>
+          <w:t xml:space="preserve">[2]</w:t>
         </w:r>
       </w:hyperlink>
       <w:r>
@@ -2201,7 +2287,7 @@
         </w:rPr>
         <w:t xml:space="preserve"> </w:t>
       </w:r>
-      <w:hyperlink w:history="1" r:id="rIdgyvwxngisw93k7tf2oyg0">
+      <w:hyperlink w:history="1" r:id="rIdb1vs8i077d-w_w1eydnbo">
         <w:r>
           <w:rPr>
             <w:rFonts w:ascii="Calibri" w:cs="Calibri" w:eastAsia="Calibri" w:hAnsi="Calibri"/>
@@ -2209,7 +2295,7 @@
             <w:sz w:val="17"/>
             <w:szCs w:val="17"/>
           </w:rPr>
-          <w:t xml:space="preserve">[4]</w:t>
+          <w:t xml:space="preserve">[3]</w:t>
         </w:r>
       </w:hyperlink>
       <w:r>
@@ -2221,7 +2307,7 @@
         </w:rPr>
         <w:t xml:space="preserve"> </w:t>
       </w:r>
-      <w:hyperlink w:history="1" r:id="rId9funrqhpyjz3xniig2qwv">
+      <w:hyperlink w:history="1" r:id="rIdmd8immsvou9ln920c_xlb">
         <w:r>
           <w:rPr>
             <w:rFonts w:ascii="Calibri" w:cs="Calibri" w:eastAsia="Calibri" w:hAnsi="Calibri"/>
@@ -2229,9 +2315,28 @@
             <w:sz w:val="17"/>
             <w:szCs w:val="17"/>
           </w:rPr>
-          <w:t xml:space="preserve">[5]</w:t>
-        </w:r>
-      </w:hyperlink>
+          <w:t xml:space="preserve">[4]</w:t>
+        </w:r>
+      </w:hyperlink>
+    </w:p>
+    <w:p>
+      <w:pPr>
+        <w:pStyle w:val="ListParagraph"/>
+        <w:numPr>
+          <w:ilvl w:val="0"/>
+          <w:numId w:val="2"/>
+        </w:numPr>
+        <w:spacing w:after="50" w:line="259"/>
+      </w:pPr>
+      <w:r>
+        <w:rPr>
+          <w:rFonts w:ascii="Calibri" w:cs="Calibri" w:eastAsia="Calibri" w:hAnsi="Calibri"/>
+          <w:color w:val="1A1A1A"/>
+          <w:sz w:val="21"/>
+          <w:szCs w:val="21"/>
+        </w:rPr>
+        <w:t xml:space="preserve">Employees praise the training and onboarding. A 2026 Indeed review calls it 'incredible,' and others cite coaching and self-help training resources. This suggests the company values training, which fits an enablement role.</w:t>
+      </w:r>
       <w:r>
         <w:rPr>
           <w:rFonts w:ascii="Calibri" w:cs="Calibri" w:eastAsia="Calibri" w:hAnsi="Calibri"/>
@@ -2241,7 +2346,7 @@
         </w:rPr>
         <w:t xml:space="preserve"> </w:t>
       </w:r>
-      <w:hyperlink w:history="1" r:id="rIdqpvr_debfb-bqamlfajfj">
+      <w:hyperlink w:history="1" r:id="rIdqlazm0v1uifph4njjgfbo">
         <w:r>
           <w:rPr>
             <w:rFonts w:ascii="Calibri" w:cs="Calibri" w:eastAsia="Calibri" w:hAnsi="Calibri"/>
@@ -2249,7 +2354,7 @@
             <w:sz w:val="17"/>
             <w:szCs w:val="17"/>
           </w:rPr>
-          <w:t xml:space="preserve">[6]</w:t>
+          <w:t xml:space="preserve">[1]</w:t>
         </w:r>
       </w:hyperlink>
       <w:r>
@@ -2261,7 +2366,7 @@
         </w:rPr>
         <w:t xml:space="preserve"> </w:t>
       </w:r>
-      <w:hyperlink w:history="1" r:id="rIdg_onufbt0_hij6e161qnu">
+      <w:hyperlink w:history="1" r:id="rIddu8dypmvok_7fef6mbkzj">
         <w:r>
           <w:rPr>
             <w:rFonts w:ascii="Calibri" w:cs="Calibri" w:eastAsia="Calibri" w:hAnsi="Calibri"/>
@@ -2269,9 +2374,28 @@
             <w:sz w:val="17"/>
             <w:szCs w:val="17"/>
           </w:rPr>
-          <w:t xml:space="preserve">[7]</w:t>
-        </w:r>
-      </w:hyperlink>
+          <w:t xml:space="preserve">[2]</w:t>
+        </w:r>
+      </w:hyperlink>
+    </w:p>
+    <w:p>
+      <w:pPr>
+        <w:pStyle w:val="ListParagraph"/>
+        <w:numPr>
+          <w:ilvl w:val="0"/>
+          <w:numId w:val="2"/>
+        </w:numPr>
+        <w:spacing w:after="50" w:line="259"/>
+      </w:pPr>
+      <w:r>
+        <w:rPr>
+          <w:rFonts w:ascii="Calibri" w:cs="Calibri" w:eastAsia="Calibri" w:hAnsi="Calibri"/>
+          <w:color w:val="1A1A1A"/>
+          <w:sz w:val="21"/>
+          <w:szCs w:val="21"/>
+        </w:rPr>
+        <w:t xml:space="preserve">Coworkers and team culture get good marks. CareerBliss reviewers list culture, people, and managers as pros (4.1 average, but only 13 ratings). Comparably employees are most satisfied with team, environment, and meetings. One Glassdoor review title reads 'Good teammates and overall company culture.'</w:t>
+      </w:r>
       <w:r>
         <w:rPr>
           <w:rFonts w:ascii="Calibri" w:cs="Calibri" w:eastAsia="Calibri" w:hAnsi="Calibri"/>
@@ -2281,7 +2405,7 @@
         </w:rPr>
         <w:t xml:space="preserve"> </w:t>
       </w:r>
-      <w:hyperlink w:history="1" r:id="rIdkmqfxpu2vic2neq3nji4q">
+      <w:hyperlink w:history="1" r:id="rIdaihwigdpz-uxjep39ogua">
         <w:r>
           <w:rPr>
             <w:rFonts w:ascii="Calibri" w:cs="Calibri" w:eastAsia="Calibri" w:hAnsi="Calibri"/>
@@ -2289,28 +2413,9 @@
             <w:sz w:val="17"/>
             <w:szCs w:val="17"/>
           </w:rPr>
-          <w:t xml:space="preserve">[8]</w:t>
-        </w:r>
-      </w:hyperlink>
-    </w:p>
-    <w:p>
-      <w:pPr>
-        <w:pStyle w:val="ListParagraph"/>
-        <w:numPr>
-          <w:ilvl w:val="0"/>
-          <w:numId w:val="2"/>
-        </w:numPr>
-        <w:spacing w:after="50" w:line="259"/>
-      </w:pPr>
-      <w:r>
-        <w:rPr>
-          <w:rFonts w:ascii="Calibri" w:cs="Calibri" w:eastAsia="Calibri" w:hAnsi="Calibri"/>
-          <w:color w:val="1A1A1A"/>
-          <w:sz w:val="21"/>
-          <w:szCs w:val="21"/>
-        </w:rPr>
-        <w:t xml:space="preserve">The role comes with ownership and room for judgment. The Specialist owns a function, designs its programs and content, sets the measures of success (adoption, proficiency, satisfaction), works under general direction, and mentors less experienced staff.</w:t>
-      </w:r>
+          <w:t xml:space="preserve">[1]</w:t>
+        </w:r>
+      </w:hyperlink>
       <w:r>
         <w:rPr>
           <w:rFonts w:ascii="Calibri" w:cs="Calibri" w:eastAsia="Calibri" w:hAnsi="Calibri"/>
@@ -2320,7 +2425,7 @@
         </w:rPr>
         <w:t xml:space="preserve"> </w:t>
       </w:r>
-      <w:hyperlink w:history="1" r:id="rIdex2ewyyzd_u6fceyr6xxs">
+      <w:hyperlink w:history="1" r:id="rIdd4jm7edqdo-4rwdilcnz7">
         <w:r>
           <w:rPr>
             <w:rFonts w:ascii="Calibri" w:cs="Calibri" w:eastAsia="Calibri" w:hAnsi="Calibri"/>
@@ -2328,28 +2433,9 @@
             <w:sz w:val="17"/>
             <w:szCs w:val="17"/>
           </w:rPr>
-          <w:t xml:space="preserve">[1]</w:t>
-        </w:r>
-      </w:hyperlink>
-    </w:p>
-    <w:p>
-      <w:pPr>
-        <w:pStyle w:val="ListParagraph"/>
-        <w:numPr>
-          <w:ilvl w:val="0"/>
-          <w:numId w:val="2"/>
-        </w:numPr>
-        <w:spacing w:after="50" w:line="259"/>
-      </w:pPr>
-      <w:r>
-        <w:rPr>
-          <w:rFonts w:ascii="Calibri" w:cs="Calibri" w:eastAsia="Calibri" w:hAnsi="Calibri"/>
-          <w:color w:val="1A1A1A"/>
-          <w:sz w:val="21"/>
-          <w:szCs w:val="21"/>
-        </w:rPr>
-        <w:t xml:space="preserve">An AI team appears to exist already. The posting says the role partners with AI Engineers, Data Scientists, Product, and IT, and that it delivers the enablement parts of AI rollouts, including Microsoft 365 and Copilot.</w:t>
-      </w:r>
+          <w:t xml:space="preserve">[2]</w:t>
+        </w:r>
+      </w:hyperlink>
       <w:r>
         <w:rPr>
           <w:rFonts w:ascii="Calibri" w:cs="Calibri" w:eastAsia="Calibri" w:hAnsi="Calibri"/>
@@ -2359,7 +2445,7 @@
         </w:rPr>
         <w:t xml:space="preserve"> </w:t>
       </w:r>
-      <w:hyperlink w:history="1" r:id="rIde2ghvilaxsbrjfrmuz_gv">
+      <w:hyperlink w:history="1" r:id="rIduw3o4stfwlt-ppoxhqdxm">
         <w:r>
           <w:rPr>
             <w:rFonts w:ascii="Calibri" w:cs="Calibri" w:eastAsia="Calibri" w:hAnsi="Calibri"/>
@@ -2367,7 +2453,145 @@
             <w:sz w:val="17"/>
             <w:szCs w:val="17"/>
           </w:rPr>
+          <w:t xml:space="preserve">[3]</w:t>
+        </w:r>
+      </w:hyperlink>
+    </w:p>
+    <w:p>
+      <w:pPr>
+        <w:pStyle w:val="ListParagraph"/>
+        <w:numPr>
+          <w:ilvl w:val="0"/>
+          <w:numId w:val="2"/>
+        </w:numPr>
+        <w:spacing w:after="50" w:line="259"/>
+      </w:pPr>
+      <w:r>
+        <w:rPr>
+          <w:rFonts w:ascii="Calibri" w:cs="Calibri" w:eastAsia="Calibri" w:hAnsi="Calibri"/>
+          <w:color w:val="1A1A1A"/>
+          <w:sz w:val="21"/>
+          <w:szCs w:val="21"/>
+        </w:rPr>
+        <w:t xml:space="preserve">Leadership stayed in place after the Bayview buyout. The executive team and the brand were kept, the CEO told staff the deal should feel like a 'non-event,' and no layoffs tied to the deal have been reported.</w:t>
+      </w:r>
+      <w:r>
+        <w:rPr>
+          <w:rFonts w:ascii="Calibri" w:cs="Calibri" w:eastAsia="Calibri" w:hAnsi="Calibri"/>
+          <w:color w:val="1A1A1A"/>
+          <w:sz w:val="21"/>
+          <w:szCs w:val="21"/>
+        </w:rPr>
+        <w:t xml:space="preserve"> </w:t>
+      </w:r>
+      <w:hyperlink w:history="1" r:id="rIdngho7b96td6197buonm5u">
+        <w:r>
+          <w:rPr>
+            <w:rFonts w:ascii="Calibri" w:cs="Calibri" w:eastAsia="Calibri" w:hAnsi="Calibri"/>
+            <w:color w:val="1A4D8F"/>
+            <w:sz w:val="17"/>
+            <w:szCs w:val="17"/>
+          </w:rPr>
           <w:t xml:space="preserve">[1]</w:t>
+        </w:r>
+      </w:hyperlink>
+      <w:r>
+        <w:rPr>
+          <w:rFonts w:ascii="Calibri" w:cs="Calibri" w:eastAsia="Calibri" w:hAnsi="Calibri"/>
+          <w:color w:val="1A1A1A"/>
+          <w:sz w:val="21"/>
+          <w:szCs w:val="21"/>
+        </w:rPr>
+        <w:t xml:space="preserve"> </w:t>
+      </w:r>
+      <w:hyperlink w:history="1" r:id="rIdcxx0dian1a0cfof_bwugr">
+        <w:r>
+          <w:rPr>
+            <w:rFonts w:ascii="Calibri" w:cs="Calibri" w:eastAsia="Calibri" w:hAnsi="Calibri"/>
+            <w:color w:val="1A4D8F"/>
+            <w:sz w:val="17"/>
+            <w:szCs w:val="17"/>
+          </w:rPr>
+          <w:t xml:space="preserve">[2]</w:t>
+        </w:r>
+      </w:hyperlink>
+      <w:r>
+        <w:rPr>
+          <w:rFonts w:ascii="Calibri" w:cs="Calibri" w:eastAsia="Calibri" w:hAnsi="Calibri"/>
+          <w:color w:val="1A1A1A"/>
+          <w:sz w:val="21"/>
+          <w:szCs w:val="21"/>
+        </w:rPr>
+        <w:t xml:space="preserve"> </w:t>
+      </w:r>
+      <w:hyperlink w:history="1" r:id="rIdb9ofqhnzwaxlfc3r-ahiu">
+        <w:r>
+          <w:rPr>
+            <w:rFonts w:ascii="Calibri" w:cs="Calibri" w:eastAsia="Calibri" w:hAnsi="Calibri"/>
+            <w:color w:val="1A4D8F"/>
+            <w:sz w:val="17"/>
+            <w:szCs w:val="17"/>
+          </w:rPr>
+          <w:t xml:space="preserve">[3]</w:t>
+        </w:r>
+      </w:hyperlink>
+    </w:p>
+    <w:p>
+      <w:pPr>
+        <w:pStyle w:val="ListParagraph"/>
+        <w:numPr>
+          <w:ilvl w:val="0"/>
+          <w:numId w:val="2"/>
+        </w:numPr>
+        <w:spacing w:after="50" w:line="259"/>
+      </w:pPr>
+      <w:r>
+        <w:rPr>
+          <w:rFonts w:ascii="Calibri" w:cs="Calibri" w:eastAsia="Calibri" w:hAnsi="Calibri"/>
+          <w:color w:val="1A1A1A"/>
+          <w:sz w:val="21"/>
+          <w:szCs w:val="21"/>
+        </w:rPr>
+        <w:t xml:space="preserve">The pay range is posted ($82,506 to $118,345, exempt, full-time), and the overall Glassdoor rating (3.5) is in line with the finance industry average.</w:t>
+      </w:r>
+      <w:r>
+        <w:rPr>
+          <w:rFonts w:ascii="Calibri" w:cs="Calibri" w:eastAsia="Calibri" w:hAnsi="Calibri"/>
+          <w:color w:val="1A1A1A"/>
+          <w:sz w:val="21"/>
+          <w:szCs w:val="21"/>
+        </w:rPr>
+        <w:t xml:space="preserve"> </w:t>
+      </w:r>
+      <w:hyperlink w:history="1" r:id="rIdacetvow_ktt7eoqrpv2dr">
+        <w:r>
+          <w:rPr>
+            <w:rFonts w:ascii="Calibri" w:cs="Calibri" w:eastAsia="Calibri" w:hAnsi="Calibri"/>
+            <w:color w:val="1A4D8F"/>
+            <w:sz w:val="17"/>
+            <w:szCs w:val="17"/>
+          </w:rPr>
+          <w:t xml:space="preserve">[1]</w:t>
+        </w:r>
+      </w:hyperlink>
+      <w:r>
+        <w:rPr>
+          <w:rFonts w:ascii="Calibri" w:cs="Calibri" w:eastAsia="Calibri" w:hAnsi="Calibri"/>
+          <w:color w:val="1A1A1A"/>
+          <w:sz w:val="21"/>
+          <w:szCs w:val="21"/>
+        </w:rPr>
+        <w:t xml:space="preserve"> </w:t>
+      </w:r>
+      <w:hyperlink w:history="1" r:id="rIdgd4wbb4wfrtb7k7lkqssz">
+        <w:r>
+          <w:rPr>
+            <w:rFonts w:ascii="Calibri" w:cs="Calibri" w:eastAsia="Calibri" w:hAnsi="Calibri"/>
+            <w:color w:val="1A4D8F"/>
+            <w:sz w:val="17"/>
+            <w:szCs w:val="17"/>
+          </w:rPr>
+          <w:t xml:space="preserve">[2]</w:t>
         </w:r>
       </w:hyperlink>
     </w:p>
@@ -2403,7 +2627,7 @@
           <w:sz w:val="21"/>
           <w:szCs w:val="21"/>
         </w:rPr>
-        <w:t xml:space="preserve">The salary Dice shows can mislead. The listing displays $118,345 a year, but that is the top of the $82,506 to $118,345 range. The posting also says pay depends partly on the applicant's location, so a remote hire in a lower-cost area may get a lower offer.</w:t>
+        <w:t xml:space="preserve">Overwork is a common complaint: mandated overtime several times a week, after-hours meetings, many meetings, and some Indeed reports of 70-hour weeks. Glassdoor work-life balance fell 6% over the past year.</w:t>
       </w:r>
       <w:r>
         <w:rPr>
@@ -2414,7 +2638,7 @@
         </w:rPr>
         <w:t xml:space="preserve"> </w:t>
       </w:r>
-      <w:hyperlink w:history="1" r:id="rIdfmqkkykg1kw4oyrrxmsts">
+      <w:hyperlink w:history="1" r:id="rId2cwobbspcpy9sn24fftsw">
         <w:r>
           <w:rPr>
             <w:rFonts w:ascii="Calibri" w:cs="Calibri" w:eastAsia="Calibri" w:hAnsi="Calibri"/>
@@ -2425,25 +2649,6 @@
           <w:t xml:space="preserve">[1]</w:t>
         </w:r>
       </w:hyperlink>
-    </w:p>
-    <w:p>
-      <w:pPr>
-        <w:pStyle w:val="ListParagraph"/>
-        <w:numPr>
-          <w:ilvl w:val="0"/>
-          <w:numId w:val="2"/>
-        </w:numPr>
-        <w:spacing w:after="50" w:line="259"/>
-      </w:pPr>
-      <w:r>
-        <w:rPr>
-          <w:rFonts w:ascii="Calibri" w:cs="Calibri" w:eastAsia="Calibri" w:hAnsi="Calibri"/>
-          <w:color w:val="1A1A1A"/>
-          <w:sz w:val="21"/>
-          <w:szCs w:val="21"/>
-        </w:rPr>
-        <w:t xml:space="preserve">The scope is a mid-level individual contributor job. The posting says decisions 'primarily impact own work with limited impact on peers' and that the person 'contributes as team member rather than leader.'</w:t>
-      </w:r>
       <w:r>
         <w:rPr>
           <w:rFonts w:ascii="Calibri" w:cs="Calibri" w:eastAsia="Calibri" w:hAnsi="Calibri"/>
@@ -2453,7 +2658,7 @@
         </w:rPr>
         <w:t xml:space="preserve"> </w:t>
       </w:r>
-      <w:hyperlink w:history="1" r:id="rId7ucp1i8mq88--_-lk-jap">
+      <w:hyperlink w:history="1" r:id="rIdoedweuy10dzbdaofhtlww">
         <w:r>
           <w:rPr>
             <w:rFonts w:ascii="Calibri" w:cs="Calibri" w:eastAsia="Calibri" w:hAnsi="Calibri"/>
@@ -2461,28 +2666,9 @@
             <w:sz w:val="17"/>
             <w:szCs w:val="17"/>
           </w:rPr>
-          <w:t xml:space="preserve">[1]</w:t>
-        </w:r>
-      </w:hyperlink>
-    </w:p>
-    <w:p>
-      <w:pPr>
-        <w:pStyle w:val="ListParagraph"/>
-        <w:numPr>
-          <w:ilvl w:val="0"/>
-          <w:numId w:val="2"/>
-        </w:numPr>
-        <w:spacing w:after="50" w:line="259"/>
-      </w:pPr>
-      <w:r>
-        <w:rPr>
-          <w:rFonts w:ascii="Calibri" w:cs="Calibri" w:eastAsia="Calibri" w:hAnsi="Calibri"/>
-          <w:color w:val="1A1A1A"/>
-          <w:sz w:val="21"/>
-          <w:szCs w:val="21"/>
-        </w:rPr>
-        <w:t xml:space="preserve">The actual assignment is not defined. The role owns 'an assigned function,' and the examples given are training, departmental enablement, communications, adoption, or an emerging program. The day-to-day work could vary widely depending on which one you get.</w:t>
-      </w:r>
+          <w:t xml:space="preserve">[2]</w:t>
+        </w:r>
+      </w:hyperlink>
       <w:r>
         <w:rPr>
           <w:rFonts w:ascii="Calibri" w:cs="Calibri" w:eastAsia="Calibri" w:hAnsi="Calibri"/>
@@ -2492,7 +2678,7 @@
         </w:rPr>
         <w:t xml:space="preserve"> </w:t>
       </w:r>
-      <w:hyperlink w:history="1" r:id="rIdqi_olxx4yxg0aluwr1j_i">
+      <w:hyperlink w:history="1" r:id="rIdb02i8fxh-oaad3ou3teqi">
         <w:r>
           <w:rPr>
             <w:rFonts w:ascii="Calibri" w:cs="Calibri" w:eastAsia="Calibri" w:hAnsi="Calibri"/>
@@ -2500,28 +2686,9 @@
             <w:sz w:val="17"/>
             <w:szCs w:val="17"/>
           </w:rPr>
-          <w:t xml:space="preserve">[1]</w:t>
-        </w:r>
-      </w:hyperlink>
-    </w:p>
-    <w:p>
-      <w:pPr>
-        <w:pStyle w:val="ListParagraph"/>
-        <w:numPr>
-          <w:ilvl w:val="0"/>
-          <w:numId w:val="2"/>
-        </w:numPr>
-        <w:spacing w:after="50" w:line="259"/>
-      </w:pPr>
-      <w:r>
-        <w:rPr>
-          <w:rFonts w:ascii="Calibri" w:cs="Calibri" w:eastAsia="Calibri" w:hAnsi="Calibri"/>
-          <w:color w:val="1A1A1A"/>
-          <w:sz w:val="21"/>
-          <w:szCs w:val="21"/>
-        </w:rPr>
-        <w:t xml:space="preserve">This is a regulated, compliance-heavy setting. Responsible AI, data privacy, and compliance standards apply to everything the role produces. The posting describes a 'fast-paced, metrics-driven environment' and names stressors including complaints, security responsibilities, and competing priorities.</w:t>
-      </w:r>
+          <w:t xml:space="preserve">[3]</w:t>
+        </w:r>
+      </w:hyperlink>
       <w:r>
         <w:rPr>
           <w:rFonts w:ascii="Calibri" w:cs="Calibri" w:eastAsia="Calibri" w:hAnsi="Calibri"/>
@@ -2531,7 +2698,7 @@
         </w:rPr>
         <w:t xml:space="preserve"> </w:t>
       </w:r>
-      <w:hyperlink w:history="1" r:id="rIdci1zxs3cyrwoz-glp3fdn">
+      <w:hyperlink w:history="1" r:id="rIdmzy5c0_4ifxd-sugvnbwm">
         <w:r>
           <w:rPr>
             <w:rFonts w:ascii="Calibri" w:cs="Calibri" w:eastAsia="Calibri" w:hAnsi="Calibri"/>
@@ -2539,27 +2706,27 @@
             <w:sz w:val="17"/>
             <w:szCs w:val="17"/>
           </w:rPr>
-          <w:t xml:space="preserve">[1]</w:t>
-        </w:r>
-      </w:hyperlink>
-    </w:p>
-    <w:p>
-      <w:pPr>
-        <w:pStyle w:val="ListParagraph"/>
-        <w:numPr>
-          <w:ilvl w:val="0"/>
-          <w:numId w:val="2"/>
-        </w:numPr>
-        <w:spacing w:after="50" w:line="259"/>
-      </w:pPr>
-      <w:r>
-        <w:rPr>
-          <w:rFonts w:ascii="Calibri" w:cs="Calibri" w:eastAsia="Calibri" w:hAnsi="Calibri"/>
-          <w:color w:val="1A1A1A"/>
-          <w:sz w:val="21"/>
-          <w:szCs w:val="21"/>
-        </w:rPr>
-        <w:t xml:space="preserve">The tools are Microsoft-centered: Microsoft 365, Copilot, and knowledge bases in SharePoint or Teams. If most of your hands-on AI work has been in other tools, expect some ramp-up, and be ready to show you can move between tools.</w:t>
+          <w:t xml:space="preserve">[4]</w:t>
+        </w:r>
+      </w:hyperlink>
+    </w:p>
+    <w:p>
+      <w:pPr>
+        <w:pStyle w:val="ListParagraph"/>
+        <w:numPr>
+          <w:ilvl w:val="0"/>
+          <w:numId w:val="2"/>
+        </w:numPr>
+        <w:spacing w:after="50" w:line="259"/>
+      </w:pPr>
+      <w:r>
+        <w:rPr>
+          <w:rFonts w:ascii="Calibri" w:cs="Calibri" w:eastAsia="Calibri" w:hAnsi="Calibri"/>
+          <w:color w:val="1A1A1A"/>
+          <w:sz w:val="21"/>
+          <w:szCs w:val="21"/>
+        </w:rPr>
+        <w:t xml:space="preserve">Management draws the most criticism. About 30 Glassdoor reviews cite poor management or unprofessional behavior, and reviewers say managers don't take feedback and can't stick with a decision. Comparably's sample (about 40) gives a net promoter score of 52% detractors and 29% promoters.</w:t>
       </w:r>
       <w:r>
         <w:rPr>
@@ -2570,7 +2737,7 @@
         </w:rPr>
         <w:t xml:space="preserve"> </w:t>
       </w:r>
-      <w:hyperlink w:history="1" r:id="rIdryeoq93e9vbociamavtgq">
+      <w:hyperlink w:history="1" r:id="rIdi6iucsjf-kydwfvtri1_n">
         <w:r>
           <w:rPr>
             <w:rFonts w:ascii="Calibri" w:cs="Calibri" w:eastAsia="Calibri" w:hAnsi="Calibri"/>
@@ -2581,25 +2748,6 @@
           <w:t xml:space="preserve">[1]</w:t>
         </w:r>
       </w:hyperlink>
-    </w:p>
-    <w:p>
-      <w:pPr>
-        <w:pStyle w:val="ListParagraph"/>
-        <w:numPr>
-          <w:ilvl w:val="0"/>
-          <w:numId w:val="2"/>
-        </w:numPr>
-        <w:spacing w:after="50" w:line="259"/>
-      </w:pPr>
-      <w:r>
-        <w:rPr>
-          <w:rFonts w:ascii="Calibri" w:cs="Calibri" w:eastAsia="Calibri" w:hAnsi="Calibri"/>
-          <w:color w:val="1A1A1A"/>
-          <w:sz w:val="21"/>
-          <w:szCs w:val="21"/>
-        </w:rPr>
-        <w:t xml:space="preserve">The benefits list leaves out paid time off, holidays, parental leave, bonus or incentive pay, and tuition or certification support. The posting alone cannot tell you how these compare to other employers.</w:t>
-      </w:r>
       <w:r>
         <w:rPr>
           <w:rFonts w:ascii="Calibri" w:cs="Calibri" w:eastAsia="Calibri" w:hAnsi="Calibri"/>
@@ -2609,7 +2757,7 @@
         </w:rPr>
         <w:t xml:space="preserve"> </w:t>
       </w:r>
-      <w:hyperlink w:history="1" r:id="rIdr0adbhtlvpz74u3yw_lzh">
+      <w:hyperlink w:history="1" r:id="rIdu62jwejszfmzt2vo6flan">
         <w:r>
           <w:rPr>
             <w:rFonts w:ascii="Calibri" w:cs="Calibri" w:eastAsia="Calibri" w:hAnsi="Calibri"/>
@@ -2617,7 +2765,323 @@
             <w:sz w:val="17"/>
             <w:szCs w:val="17"/>
           </w:rPr>
+          <w:t xml:space="preserve">[2]</w:t>
+        </w:r>
+      </w:hyperlink>
+      <w:r>
+        <w:rPr>
+          <w:rFonts w:ascii="Calibri" w:cs="Calibri" w:eastAsia="Calibri" w:hAnsi="Calibri"/>
+          <w:color w:val="1A1A1A"/>
+          <w:sz w:val="21"/>
+          <w:szCs w:val="21"/>
+        </w:rPr>
+        <w:t xml:space="preserve"> </w:t>
+      </w:r>
+      <w:hyperlink w:history="1" r:id="rIdfmt_lbxaxmzwawtrzq-6l">
+        <w:r>
+          <w:rPr>
+            <w:rFonts w:ascii="Calibri" w:cs="Calibri" w:eastAsia="Calibri" w:hAnsi="Calibri"/>
+            <w:color w:val="1A4D8F"/>
+            <w:sz w:val="17"/>
+            <w:szCs w:val="17"/>
+          </w:rPr>
+          <w:t xml:space="preserve">[3]</w:t>
+        </w:r>
+      </w:hyperlink>
+    </w:p>
+    <w:p>
+      <w:pPr>
+        <w:pStyle w:val="ListParagraph"/>
+        <w:numPr>
+          <w:ilvl w:val="0"/>
+          <w:numId w:val="2"/>
+        </w:numPr>
+        <w:spacing w:after="50" w:line="259"/>
+      </w:pPr>
+      <w:r>
+        <w:rPr>
+          <w:rFonts w:ascii="Calibri" w:cs="Calibri" w:eastAsia="Calibri" w:hAnsi="Calibri"/>
+          <w:color w:val="1A1A1A"/>
+          <w:sz w:val="21"/>
+          <w:szCs w:val="21"/>
+        </w:rPr>
+        <w:t xml:space="preserve">Pay and raises are weak spots. Reviewers report raises of 2-4% and late notice on when raises take effect, and 8 reviews say salaries are not competitive. PayScale rates fair pay at 2.4 out of 5, and CareerBliss reviewers say pay is slightly below industry standard.</w:t>
+      </w:r>
+      <w:r>
+        <w:rPr>
+          <w:rFonts w:ascii="Calibri" w:cs="Calibri" w:eastAsia="Calibri" w:hAnsi="Calibri"/>
+          <w:color w:val="1A1A1A"/>
+          <w:sz w:val="21"/>
+          <w:szCs w:val="21"/>
+        </w:rPr>
+        <w:t xml:space="preserve"> </w:t>
+      </w:r>
+      <w:hyperlink w:history="1" r:id="rIdunwo0y1ez7ml_imvqztok">
+        <w:r>
+          <w:rPr>
+            <w:rFonts w:ascii="Calibri" w:cs="Calibri" w:eastAsia="Calibri" w:hAnsi="Calibri"/>
+            <w:color w:val="1A4D8F"/>
+            <w:sz w:val="17"/>
+            <w:szCs w:val="17"/>
+          </w:rPr>
           <w:t xml:space="preserve">[1]</w:t>
+        </w:r>
+      </w:hyperlink>
+      <w:r>
+        <w:rPr>
+          <w:rFonts w:ascii="Calibri" w:cs="Calibri" w:eastAsia="Calibri" w:hAnsi="Calibri"/>
+          <w:color w:val="1A1A1A"/>
+          <w:sz w:val="21"/>
+          <w:szCs w:val="21"/>
+        </w:rPr>
+        <w:t xml:space="preserve"> </w:t>
+      </w:r>
+      <w:hyperlink w:history="1" r:id="rIdnujtd5vaba5xpcgnvelrm">
+        <w:r>
+          <w:rPr>
+            <w:rFonts w:ascii="Calibri" w:cs="Calibri" w:eastAsia="Calibri" w:hAnsi="Calibri"/>
+            <w:color w:val="1A4D8F"/>
+            <w:sz w:val="17"/>
+            <w:szCs w:val="17"/>
+          </w:rPr>
+          <w:t xml:space="preserve">[2]</w:t>
+        </w:r>
+      </w:hyperlink>
+      <w:r>
+        <w:rPr>
+          <w:rFonts w:ascii="Calibri" w:cs="Calibri" w:eastAsia="Calibri" w:hAnsi="Calibri"/>
+          <w:color w:val="1A1A1A"/>
+          <w:sz w:val="21"/>
+          <w:szCs w:val="21"/>
+        </w:rPr>
+        <w:t xml:space="preserve"> </w:t>
+      </w:r>
+      <w:hyperlink w:history="1" r:id="rIdr6yxjoagwdozhcahmbgtb">
+        <w:r>
+          <w:rPr>
+            <w:rFonts w:ascii="Calibri" w:cs="Calibri" w:eastAsia="Calibri" w:hAnsi="Calibri"/>
+            <w:color w:val="1A4D8F"/>
+            <w:sz w:val="17"/>
+            <w:szCs w:val="17"/>
+          </w:rPr>
+          <w:t xml:space="preserve">[3]</w:t>
+        </w:r>
+      </w:hyperlink>
+    </w:p>
+    <w:p>
+      <w:pPr>
+        <w:pStyle w:val="ListParagraph"/>
+        <w:numPr>
+          <w:ilvl w:val="0"/>
+          <w:numId w:val="2"/>
+        </w:numPr>
+        <w:spacing w:after="50" w:line="259"/>
+      </w:pPr>
+      <w:r>
+        <w:rPr>
+          <w:rFonts w:ascii="Calibri" w:cs="Calibri" w:eastAsia="Calibri" w:hAnsi="Calibri"/>
+          <w:color w:val="1A1A1A"/>
+          <w:sz w:val="21"/>
+          <w:szCs w:val="21"/>
+        </w:rPr>
+        <w:t xml:space="preserve">Layoffs follow the mortgage cycle. In 2022 Guild cut staff to save about $40M a year. About 200 people were cut in the Academy Mortgage acquisition, mostly back-office staff, and reviewers say Academy's corporate staff, including IT, were let go. Reviewers describe layoffs that 'happen in waves.'</w:t>
+      </w:r>
+      <w:r>
+        <w:rPr>
+          <w:rFonts w:ascii="Calibri" w:cs="Calibri" w:eastAsia="Calibri" w:hAnsi="Calibri"/>
+          <w:color w:val="1A1A1A"/>
+          <w:sz w:val="21"/>
+          <w:szCs w:val="21"/>
+        </w:rPr>
+        <w:t xml:space="preserve"> </w:t>
+      </w:r>
+      <w:hyperlink w:history="1" r:id="rIdajs6jpmmkl8wibeobwc7e">
+        <w:r>
+          <w:rPr>
+            <w:rFonts w:ascii="Calibri" w:cs="Calibri" w:eastAsia="Calibri" w:hAnsi="Calibri"/>
+            <w:color w:val="1A4D8F"/>
+            <w:sz w:val="17"/>
+            <w:szCs w:val="17"/>
+          </w:rPr>
+          <w:t xml:space="preserve">[1]</w:t>
+        </w:r>
+      </w:hyperlink>
+      <w:r>
+        <w:rPr>
+          <w:rFonts w:ascii="Calibri" w:cs="Calibri" w:eastAsia="Calibri" w:hAnsi="Calibri"/>
+          <w:color w:val="1A1A1A"/>
+          <w:sz w:val="21"/>
+          <w:szCs w:val="21"/>
+        </w:rPr>
+        <w:t xml:space="preserve"> </w:t>
+      </w:r>
+      <w:hyperlink w:history="1" r:id="rIdqoe3nqeblipaonyhqpfs2">
+        <w:r>
+          <w:rPr>
+            <w:rFonts w:ascii="Calibri" w:cs="Calibri" w:eastAsia="Calibri" w:hAnsi="Calibri"/>
+            <w:color w:val="1A4D8F"/>
+            <w:sz w:val="17"/>
+            <w:szCs w:val="17"/>
+          </w:rPr>
+          <w:t xml:space="preserve">[2]</w:t>
+        </w:r>
+      </w:hyperlink>
+      <w:r>
+        <w:rPr>
+          <w:rFonts w:ascii="Calibri" w:cs="Calibri" w:eastAsia="Calibri" w:hAnsi="Calibri"/>
+          <w:color w:val="1A1A1A"/>
+          <w:sz w:val="21"/>
+          <w:szCs w:val="21"/>
+        </w:rPr>
+        <w:t xml:space="preserve"> </w:t>
+      </w:r>
+      <w:hyperlink w:history="1" r:id="rIdiavbjg93ezy22x1ghbs3v">
+        <w:r>
+          <w:rPr>
+            <w:rFonts w:ascii="Calibri" w:cs="Calibri" w:eastAsia="Calibri" w:hAnsi="Calibri"/>
+            <w:color w:val="1A4D8F"/>
+            <w:sz w:val="17"/>
+            <w:szCs w:val="17"/>
+          </w:rPr>
+          <w:t xml:space="preserve">[3]</w:t>
+        </w:r>
+      </w:hyperlink>
+      <w:r>
+        <w:rPr>
+          <w:rFonts w:ascii="Calibri" w:cs="Calibri" w:eastAsia="Calibri" w:hAnsi="Calibri"/>
+          <w:color w:val="1A1A1A"/>
+          <w:sz w:val="21"/>
+          <w:szCs w:val="21"/>
+        </w:rPr>
+        <w:t xml:space="preserve"> </w:t>
+      </w:r>
+      <w:hyperlink w:history="1" r:id="rIduib9pnqwdojison7nr2al">
+        <w:r>
+          <w:rPr>
+            <w:rFonts w:ascii="Calibri" w:cs="Calibri" w:eastAsia="Calibri" w:hAnsi="Calibri"/>
+            <w:color w:val="1A4D8F"/>
+            <w:sz w:val="17"/>
+            <w:szCs w:val="17"/>
+          </w:rPr>
+          <w:t xml:space="preserve">[4]</w:t>
+        </w:r>
+      </w:hyperlink>
+    </w:p>
+    <w:p>
+      <w:pPr>
+        <w:pStyle w:val="ListParagraph"/>
+        <w:numPr>
+          <w:ilvl w:val="0"/>
+          <w:numId w:val="2"/>
+        </w:numPr>
+        <w:spacing w:after="50" w:line="259"/>
+      </w:pPr>
+      <w:r>
+        <w:rPr>
+          <w:rFonts w:ascii="Calibri" w:cs="Calibri" w:eastAsia="Calibri" w:hAnsi="Calibri"/>
+          <w:color w:val="1A1A1A"/>
+          <w:sz w:val="21"/>
+          <w:szCs w:val="21"/>
+        </w:rPr>
+        <w:t xml:space="preserve">Reviewers describe the technology as antiquated and proprietary and the company as disorganized. This could make driving AI adoption harder for an enablement specialist.</w:t>
+      </w:r>
+      <w:r>
+        <w:rPr>
+          <w:rFonts w:ascii="Calibri" w:cs="Calibri" w:eastAsia="Calibri" w:hAnsi="Calibri"/>
+          <w:color w:val="1A1A1A"/>
+          <w:sz w:val="21"/>
+          <w:szCs w:val="21"/>
+        </w:rPr>
+        <w:t xml:space="preserve"> </w:t>
+      </w:r>
+      <w:hyperlink w:history="1" r:id="rIdskeacd2xb0407qrpbjnfk">
+        <w:r>
+          <w:rPr>
+            <w:rFonts w:ascii="Calibri" w:cs="Calibri" w:eastAsia="Calibri" w:hAnsi="Calibri"/>
+            <w:color w:val="1A4D8F"/>
+            <w:sz w:val="17"/>
+            <w:szCs w:val="17"/>
+          </w:rPr>
+          <w:t xml:space="preserve">[1]</w:t>
+        </w:r>
+      </w:hyperlink>
+      <w:r>
+        <w:rPr>
+          <w:rFonts w:ascii="Calibri" w:cs="Calibri" w:eastAsia="Calibri" w:hAnsi="Calibri"/>
+          <w:color w:val="1A1A1A"/>
+          <w:sz w:val="21"/>
+          <w:szCs w:val="21"/>
+        </w:rPr>
+        <w:t xml:space="preserve"> </w:t>
+      </w:r>
+      <w:hyperlink w:history="1" r:id="rId0q4hvw851ydt0ww507tex">
+        <w:r>
+          <w:rPr>
+            <w:rFonts w:ascii="Calibri" w:cs="Calibri" w:eastAsia="Calibri" w:hAnsi="Calibri"/>
+            <w:color w:val="1A4D8F"/>
+            <w:sz w:val="17"/>
+            <w:szCs w:val="17"/>
+          </w:rPr>
+          <w:t xml:space="preserve">[2]</w:t>
+        </w:r>
+      </w:hyperlink>
+    </w:p>
+    <w:p>
+      <w:pPr>
+        <w:pStyle w:val="ListParagraph"/>
+        <w:numPr>
+          <w:ilvl w:val="0"/>
+          <w:numId w:val="2"/>
+        </w:numPr>
+        <w:spacing w:after="50" w:line="259"/>
+      </w:pPr>
+      <w:r>
+        <w:rPr>
+          <w:rFonts w:ascii="Calibri" w:cs="Calibri" w:eastAsia="Calibri" w:hAnsi="Calibri"/>
+          <w:color w:val="1A1A1A"/>
+          <w:sz w:val="21"/>
+          <w:szCs w:val="21"/>
+        </w:rPr>
+        <w:t xml:space="preserve">Ratings are trending down. In the September 2026 Glassdoor snapshot, culture and values fell 7% over the past year, and the recommend-to-a-friend rate ranges from 61% to 68% across snapshots.</w:t>
+      </w:r>
+      <w:r>
+        <w:rPr>
+          <w:rFonts w:ascii="Calibri" w:cs="Calibri" w:eastAsia="Calibri" w:hAnsi="Calibri"/>
+          <w:color w:val="1A1A1A"/>
+          <w:sz w:val="21"/>
+          <w:szCs w:val="21"/>
+        </w:rPr>
+        <w:t xml:space="preserve"> </w:t>
+      </w:r>
+      <w:hyperlink w:history="1" r:id="rIdsq7tu7dqdtdvlqpy5epqp">
+        <w:r>
+          <w:rPr>
+            <w:rFonts w:ascii="Calibri" w:cs="Calibri" w:eastAsia="Calibri" w:hAnsi="Calibri"/>
+            <w:color w:val="1A4D8F"/>
+            <w:sz w:val="17"/>
+            <w:szCs w:val="17"/>
+          </w:rPr>
+          <w:t xml:space="preserve">[1]</w:t>
+        </w:r>
+      </w:hyperlink>
+      <w:r>
+        <w:rPr>
+          <w:rFonts w:ascii="Calibri" w:cs="Calibri" w:eastAsia="Calibri" w:hAnsi="Calibri"/>
+          <w:color w:val="1A1A1A"/>
+          <w:sz w:val="21"/>
+          <w:szCs w:val="21"/>
+        </w:rPr>
+        <w:t xml:space="preserve"> </w:t>
+      </w:r>
+      <w:hyperlink w:history="1" r:id="rId2jcs-qdacyny5diwij04n">
+        <w:r>
+          <w:rPr>
+            <w:rFonts w:ascii="Calibri" w:cs="Calibri" w:eastAsia="Calibri" w:hAnsi="Calibri"/>
+            <w:color w:val="1A4D8F"/>
+            <w:sz w:val="17"/>
+            <w:szCs w:val="17"/>
+          </w:rPr>
+          <w:t xml:space="preserve">[2]</w:t>
         </w:r>
       </w:hyperlink>
     </w:p>
@@ -2653,83 +3117,121 @@
           <w:sz w:val="21"/>
           <w:szCs w:val="21"/>
         </w:rPr>
-        <w:t xml:space="preserve">Employee sentiment is unknown. No Glassdoor, Indeed, or Reddit data was collected: the web search limit was used up, the Indeed connector failed, and the sites are blocked here. Read reviews yourself before an offer, with attention to corporate and IT roles and to anything from 2025 to 2026.</w:t>
-      </w:r>
-    </w:p>
-    <w:p>
-      <w:pPr>
-        <w:pStyle w:val="ListParagraph"/>
-        <w:numPr>
-          <w:ilvl w:val="0"/>
-          <w:numId w:val="2"/>
-        </w:numPr>
-        <w:spacing w:after="50" w:line="259"/>
-      </w:pPr>
-      <w:r>
-        <w:rPr>
-          <w:rFonts w:ascii="Calibri" w:cs="Calibri" w:eastAsia="Calibri" w:hAnsi="Calibri"/>
-          <w:color w:val="1A1A1A"/>
-          <w:sz w:val="21"/>
-          <w:szCs w:val="21"/>
-        </w:rPr>
-        <w:t xml:space="preserve">Layoffs, leadership turnover, and return-to-office policy were not checked. Ask whether Guild has cut staff in the last two years, how corporate and IT headcount has changed, and whether remote status for this role is permanent.</w:t>
-      </w:r>
-    </w:p>
-    <w:p>
-      <w:pPr>
-        <w:pStyle w:val="ListParagraph"/>
-        <w:numPr>
-          <w:ilvl w:val="0"/>
-          <w:numId w:val="2"/>
-        </w:numPr>
-        <w:spacing w:after="50" w:line="259"/>
-      </w:pPr>
-      <w:r>
-        <w:rPr>
-          <w:rFonts w:ascii="Calibri" w:cs="Calibri" w:eastAsia="Calibri" w:hAnsi="Calibri"/>
-          <w:color w:val="1A1A1A"/>
-          <w:sz w:val="21"/>
-          <w:szCs w:val="21"/>
-        </w:rPr>
-        <w:t xml:space="preserve">Guild's VP and Chief Information Security Officer role is open (posted September 14, 2026). Ask whether it is a new role or a backfill, and who sets AI governance and data-handling policy in the meantime.</w:t>
-      </w:r>
-    </w:p>
-    <w:p>
-      <w:pPr>
-        <w:pStyle w:val="ListParagraph"/>
-        <w:numPr>
-          <w:ilvl w:val="0"/>
-          <w:numId w:val="2"/>
-        </w:numPr>
-        <w:spacing w:after="50" w:line="259"/>
-      </w:pPr>
-      <w:r>
-        <w:rPr>
-          <w:rFonts w:ascii="Calibri" w:cs="Calibri" w:eastAsia="Calibri" w:hAnsi="Calibri"/>
-          <w:color w:val="1A1A1A"/>
-          <w:sz w:val="21"/>
-          <w:szCs w:val="21"/>
-        </w:rPr>
-        <w:t xml:space="preserve">Guild has posted 10 remote tech and data roles on Dice since September 4, 2026. That may mean growth or it may mean turnover. Ask which roles are new headcount.</w:t>
-      </w:r>
-    </w:p>
-    <w:p>
-      <w:pPr>
-        <w:pStyle w:val="ListParagraph"/>
-        <w:numPr>
-          <w:ilvl w:val="0"/>
-          <w:numId w:val="2"/>
-        </w:numPr>
-        <w:spacing w:after="50" w:line="259"/>
-      </w:pPr>
-      <w:r>
-        <w:rPr>
-          <w:rFonts w:ascii="Calibri" w:cs="Calibri" w:eastAsia="Calibri" w:hAnsi="Calibri"/>
-          <w:color w:val="1A1A1A"/>
-          <w:sz w:val="21"/>
-          <w:szCs w:val="21"/>
-        </w:rPr>
-        <w:t xml:space="preserve">Questions for the interview: Which function would this role own? Who does it report to? How big is the AI and enablement team? Which AI tools are live today, and which are planned? How will adoption and proficiency be measured in the first 6 to 12 months? Is there a location-based pay adjustment, and where would an offer land in the $82,506 to $118,345 range?</w:t>
+        <w:t xml:space="preserve">New owner: Bayview took Guild private in December 2025. No layoffs have been reported since, but budgets and priorities for newer functions such as AI enablement could change under the new owner. Ask how the AI program is funded and who sponsors it.</w:t>
+      </w:r>
+    </w:p>
+    <w:p>
+      <w:pPr>
+        <w:pStyle w:val="ListParagraph"/>
+        <w:numPr>
+          <w:ilvl w:val="0"/>
+          <w:numId w:val="2"/>
+        </w:numPr>
+        <w:spacing w:after="50" w:line="259"/>
+      </w:pPr>
+      <w:r>
+        <w:rPr>
+          <w:rFonts w:ascii="Calibri" w:cs="Calibri" w:eastAsia="Calibri" w:hAnsi="Calibri"/>
+          <w:color w:val="1A1A1A"/>
+          <w:sz w:val="21"/>
+          <w:szCs w:val="21"/>
+        </w:rPr>
+        <w:t xml:space="preserve">Layoff history: about $40M a year in cuts in 2022, and about 200 cut in the Academy acquisition, mostly back office including IT. Corporate support roles have been cut before.</w:t>
+      </w:r>
+    </w:p>
+    <w:p>
+      <w:pPr>
+        <w:pStyle w:val="ListParagraph"/>
+        <w:numPr>
+          <w:ilvl w:val="0"/>
+          <w:numId w:val="2"/>
+        </w:numPr>
+        <w:spacing w:after="50" w:line="259"/>
+      </w:pPr>
+      <w:r>
+        <w:rPr>
+          <w:rFonts w:ascii="Calibri" w:cs="Calibri" w:eastAsia="Calibri" w:hAnsi="Calibri"/>
+          <w:color w:val="1A1A1A"/>
+          <w:sz w:val="21"/>
+          <w:szCs w:val="21"/>
+        </w:rPr>
+        <w:t xml:space="preserve">Remote policy is not confirmed. Flex Index lists a 3-day corporate office rule, but that page says its content is AI-generated and unverified. Get remote status for Arizona in writing.</w:t>
+      </w:r>
+    </w:p>
+    <w:p>
+      <w:pPr>
+        <w:pStyle w:val="ListParagraph"/>
+        <w:numPr>
+          <w:ilvl w:val="0"/>
+          <w:numId w:val="2"/>
+        </w:numPr>
+        <w:spacing w:after="50" w:line="259"/>
+      </w:pPr>
+      <w:r>
+        <w:rPr>
+          <w:rFonts w:ascii="Calibri" w:cs="Calibri" w:eastAsia="Calibri" w:hAnsi="Calibri"/>
+          <w:color w:val="1A1A1A"/>
+          <w:sz w:val="21"/>
+          <w:szCs w:val="21"/>
+        </w:rPr>
+        <w:t xml:space="preserve">Pay listings disagree: Edtech.com shows $82,506-$118,345, while Built In shows a flat $118K. Confirm the actual band and where you would land in it.</w:t>
+      </w:r>
+    </w:p>
+    <w:p>
+      <w:pPr>
+        <w:pStyle w:val="ListParagraph"/>
+        <w:numPr>
+          <w:ilvl w:val="0"/>
+          <w:numId w:val="2"/>
+        </w:numPr>
+        <w:spacing w:after="50" w:line="259"/>
+      </w:pPr>
+      <w:r>
+        <w:rPr>
+          <w:rFonts w:ascii="Calibri" w:cs="Calibri" w:eastAsia="Calibri" w:hAnsi="Calibri"/>
+          <w:color w:val="1A1A1A"/>
+          <w:sz w:val="21"/>
+          <w:szCs w:val="21"/>
+        </w:rPr>
+        <w:t xml:space="preserve">Litigation with former staff: Guild won a $10.7M arbitration award against three ex-employees who moved to CrossCountry, a former Northeast division VP sued over $750K in unpaid compensation and wrongful termination, and Guild paid an older ~$25M FHA False Claims Act settlement. Read any non-solicit or non-compete terms in the offer.</w:t>
+      </w:r>
+    </w:p>
+    <w:p>
+      <w:pPr>
+        <w:pStyle w:val="ListParagraph"/>
+        <w:numPr>
+          <w:ilvl w:val="0"/>
+          <w:numId w:val="2"/>
+        </w:numPr>
+        <w:spacing w:after="50" w:line="259"/>
+      </w:pPr>
+      <w:r>
+        <w:rPr>
+          <w:rFonts w:ascii="Calibri" w:cs="Calibri" w:eastAsia="Calibri" w:hAnsi="Calibri"/>
+          <w:color w:val="1A1A1A"/>
+          <w:sz w:val="21"/>
+          <w:szCs w:val="21"/>
+        </w:rPr>
+        <w:t xml:space="preserve">Small or old samples: Blind has 1 review (2021), CareerBliss has 13 ratings, and Comparably has about 40-50. No Reddit threads were found. No reviews are specific to training, AI, or marketing/creative teams, so the company-wide ratings come from sales and operations staff.</w:t>
+      </w:r>
+    </w:p>
+    <w:p>
+      <w:pPr>
+        <w:pStyle w:val="ListParagraph"/>
+        <w:numPr>
+          <w:ilvl w:val="0"/>
+          <w:numId w:val="2"/>
+        </w:numPr>
+        <w:spacing w:after="50" w:line="259"/>
+      </w:pPr>
+      <w:r>
+        <w:rPr>
+          <w:rFonts w:ascii="Calibri" w:cs="Calibri" w:eastAsia="Calibri" w:hAnsi="Calibri"/>
+          <w:color w:val="1A1A1A"/>
+          <w:sz w:val="21"/>
+          <w:szCs w:val="21"/>
+        </w:rPr>
+        <w:t xml:space="preserve">The Indeed MCP tool failed to connect, so Indeed figures come from search-result snapshots only.</w:t>
       </w:r>
     </w:p>
     <w:p>
@@ -2759,7 +3261,7 @@
           <w:sz w:val="21"/>
           <w:szCs w:val="21"/>
         </w:rPr>
-        <w:t xml:space="preserve">Going by the posting, this is a sound remote role. The range is published ($82,506 to $118,345), the benefits are standard, you would own a defined area of work, and an AI team with engineers and data scientists is already in place. Guild's fall 2026 hiring of remote tech and data roles suggests the company is investing in technology. The main gap is employee sentiment: no Glassdoor, Indeed, or Reddit data could be gathered in this run, so culture, layoffs, management quality, and pay satisfaction are unknown. Before accepting an offer, check reviews yourself. In interviews, pin down which function you would own, where in the range the offer would land given your location, and whether the role will stay remote.</w:t>
+        <w:t xml:space="preserve">Guild is a middle-of-the-road employer (Glassdoor 3.5, Indeed 3.4). Most reviews come from loan officers and processors, not corporate training or AI staff, so they say little about this team. The case for the role: it is remote in the US, Guild is building a real AI function (GuildGPT, AI governance, AI engineering), employees value training, and the pay range is posted. The risks: overwork, criticism of management, small raises, layoffs that follow the mortgage cycle, culture scores dropping over the past year, and a new owner since December 2025. Questions to ask in interviews: Who leads the AI program and how big is the team? How did the Bayview deal affect budget and headcount for AI work? Is the role fully remote from Arizona, in writing? What is the raise cycle? What happened to corporate roles during past downturns?</w:t>
       </w:r>
     </w:p>
     <w:p>
@@ -2790,7 +3292,7 @@
         </w:numPr>
         <w:spacing w:after="50" w:line="259"/>
       </w:pPr>
-      <w:hyperlink w:history="1" r:id="rIdmpiubxmn6vgw6cqoe5vpe">
+      <w:hyperlink w:history="1" r:id="rIdeuhfy3fov--pvnjak3ytu">
         <w:r>
           <w:rPr>
             <w:rFonts w:ascii="Calibri" w:cs="Calibri" w:eastAsia="Calibri" w:hAnsi="Calibri"/>
@@ -2799,7 +3301,7 @@
             <w:szCs w:val="21"/>
             <w:u w:val="single"/>
           </w:rPr>
-          <w:t xml:space="preserve">Dice: Guild Mortgage Company, AI Training &amp; Enablement Specialist (Remote, posted 2026-10-02)</w:t>
+          <w:t xml:space="preserve">Glassdoor overview (NZ mirror) - 3.5 rating, 591 reviews</w:t>
         </w:r>
       </w:hyperlink>
       <w:r>
@@ -2809,7 +3311,7 @@
           <w:sz w:val="17"/>
           <w:szCs w:val="17"/>
         </w:rPr>
-        <w:t xml:space="preserve">  https://www.dice.com/job-detail/e5197677-e399-4bf8-9cfa-94e6f69de638?utm_source=claude-user&amp;utm_medium=mcp</w:t>
+        <w:t xml:space="preserve">  https://www.glassdoor.co.nz/Overview/Working-at-EI_IE5605.htm</w:t>
       </w:r>
     </w:p>
     <w:p>
@@ -2821,7 +3323,7 @@
         </w:numPr>
         <w:spacing w:after="50" w:line="259"/>
       </w:pPr>
-      <w:hyperlink w:history="1" r:id="rIdd6ze3_rmreni99xx_2wfn">
+      <w:hyperlink w:history="1" r:id="rIdoomffzkgeni7yx7fmot05">
         <w:r>
           <w:rPr>
             <w:rFonts w:ascii="Calibri" w:cs="Calibri" w:eastAsia="Calibri" w:hAnsi="Calibri"/>
@@ -2830,7 +3332,7 @@
             <w:szCs w:val="21"/>
             <w:u w:val="single"/>
           </w:rPr>
-          <w:t xml:space="preserve">Dice: Guild company page</w:t>
+          <w:t xml:space="preserve">Glassdoor overview (ES mirror) - Sept 2026 culture/WLB trends</w:t>
         </w:r>
       </w:hyperlink>
       <w:r>
@@ -2840,7 +3342,7 @@
           <w:sz w:val="17"/>
           <w:szCs w:val="17"/>
         </w:rPr>
-        <w:t xml:space="preserve">  https://www.dice.com/company/80184063</w:t>
+        <w:t xml:space="preserve">  https://static.glassdoor.es/Overview/Working-at-EI_IE5605.htm</w:t>
       </w:r>
     </w:p>
     <w:p>
@@ -2852,7 +3354,7 @@
         </w:numPr>
         <w:spacing w:after="50" w:line="259"/>
       </w:pPr>
-      <w:hyperlink w:history="1" r:id="rIdmh38hdau9uk6egyojjjkh">
+      <w:hyperlink w:history="1" r:id="rId9hmw3oerpgdophunuqfhi">
         <w:r>
           <w:rPr>
             <w:rFonts w:ascii="Calibri" w:cs="Calibri" w:eastAsia="Calibri" w:hAnsi="Calibri"/>
@@ -2861,7 +3363,7 @@
             <w:szCs w:val="21"/>
             <w:u w:val="single"/>
           </w:rPr>
-          <w:t xml:space="preserve">Dice: Guild, Lead Software Engineer (Remote, posted 2026-10-08)</w:t>
+          <w:t xml:space="preserve">Glassdoor review - Poor Work Life Balance (Payroll Administrator)</w:t>
         </w:r>
       </w:hyperlink>
       <w:r>
@@ -2871,7 +3373,7 @@
           <w:sz w:val="17"/>
           <w:szCs w:val="17"/>
         </w:rPr>
-        <w:t xml:space="preserve">  https://www.dice.com/job-detail/ad751468-25e6-4e32-bbd8-dbd61182615f?utm_source=claude-user&amp;utm_medium=mcp</w:t>
+        <w:t xml:space="preserve">  https://www.glassdoor.com/Reviews/Employee-Review-Guild-Mortgage-E5605-RVW82939866.htm</w:t>
       </w:r>
     </w:p>
     <w:p>
@@ -2883,7 +3385,7 @@
         </w:numPr>
         <w:spacing w:after="50" w:line="259"/>
       </w:pPr>
-      <w:hyperlink w:history="1" r:id="rIdpqi4e8dkm_ig9vf6pfo81">
+      <w:hyperlink w:history="1" r:id="rIdmw06okjguzxb2kgcwfgnt">
         <w:r>
           <w:rPr>
             <w:rFonts w:ascii="Calibri" w:cs="Calibri" w:eastAsia="Calibri" w:hAnsi="Calibri"/>
@@ -2892,7 +3394,7 @@
             <w:szCs w:val="21"/>
             <w:u w:val="single"/>
           </w:rPr>
-          <w:t xml:space="preserve">Dice: Guild, Principal Integration Architect (Remote, posted 2026-10-02)</w:t>
+          <w:t xml:space="preserve">Glassdoor review (DE mirror) - Poor Work Life Balance</w:t>
         </w:r>
       </w:hyperlink>
       <w:r>
@@ -2902,7 +3404,7 @@
           <w:sz w:val="17"/>
           <w:szCs w:val="17"/>
         </w:rPr>
-        <w:t xml:space="preserve">  https://www.dice.com/job-detail/2401df8c-86c8-482b-90d5-1f09edeadf6c?utm_source=claude-user&amp;utm_medium=mcp</w:t>
+        <w:t xml:space="preserve">  https://www.glassdoor.de/Bewertungen/Bewertungen-Guild-Mortgage-E5605-RVW82939866.htm</w:t>
       </w:r>
     </w:p>
     <w:p>
@@ -2914,7 +3416,7 @@
         </w:numPr>
         <w:spacing w:after="50" w:line="259"/>
       </w:pPr>
-      <w:hyperlink w:history="1" r:id="rId_gxfsmnvbqgcc0e96xpqe">
+      <w:hyperlink w:history="1" r:id="rIdetbq75pexaypl9luwel45">
         <w:r>
           <w:rPr>
             <w:rFonts w:ascii="Calibri" w:cs="Calibri" w:eastAsia="Calibri" w:hAnsi="Calibri"/>
@@ -2923,7 +3425,7 @@
             <w:szCs w:val="21"/>
             <w:u w:val="single"/>
           </w:rPr>
-          <w:t xml:space="preserve">Dice: Guild, Senior Cloud Architect (Remote, posted 2026-09-12)</w:t>
+          <w:t xml:space="preserve">Glassdoor review - Good teammates but often overworked</w:t>
         </w:r>
       </w:hyperlink>
       <w:r>
@@ -2933,7 +3435,7 @@
           <w:sz w:val="17"/>
           <w:szCs w:val="17"/>
         </w:rPr>
-        <w:t xml:space="preserve">  https://www.dice.com/job-detail/5410edc2-59af-47c0-acce-2665696dd02f?utm_source=claude-user&amp;utm_medium=mcp</w:t>
+        <w:t xml:space="preserve">  https://www.glassdoor.com/Reviews/Employee-Review-Guild-Mortgage-E5605-RVW72701056.htm</w:t>
       </w:r>
     </w:p>
     <w:p>
@@ -2945,7 +3447,7 @@
         </w:numPr>
         <w:spacing w:after="50" w:line="259"/>
       </w:pPr>
-      <w:hyperlink w:history="1" r:id="rIdr9kdyiirlnpxutronxsyh">
+      <w:hyperlink w:history="1" r:id="rId0ikwjzg6yp3jo_kbphbgt">
         <w:r>
           <w:rPr>
             <w:rFonts w:ascii="Calibri" w:cs="Calibri" w:eastAsia="Calibri" w:hAnsi="Calibri"/>
@@ -2954,7 +3456,7 @@
             <w:szCs w:val="21"/>
             <w:u w:val="single"/>
           </w:rPr>
-          <w:t xml:space="preserve">Dice: Guild, Manager DevOps (Remote, posted 2026-09-04)</w:t>
+          <w:t xml:space="preserve">Glassdoor 'manager' reviews</w:t>
         </w:r>
       </w:hyperlink>
       <w:r>
@@ -2964,7 +3466,7 @@
           <w:sz w:val="17"/>
           <w:szCs w:val="17"/>
         </w:rPr>
-        <w:t xml:space="preserve">  https://www.dice.com/job-detail/aa1ff27b-1410-4ed1-b266-6900a40cba8a?utm_source=claude-user&amp;utm_medium=mcp</w:t>
+        <w:t xml:space="preserve">  https://www.glassdoor.com/Reviews/Guild-Mortgage-manager-Reviews-EI_IE5605.0,14_KH15,22.htm</w:t>
       </w:r>
     </w:p>
     <w:p>
@@ -2976,7 +3478,7 @@
         </w:numPr>
         <w:spacing w:after="50" w:line="259"/>
       </w:pPr>
-      <w:hyperlink w:history="1" r:id="rIdh2aj4itxken8r-jeqjyy5">
+      <w:hyperlink w:history="1" r:id="rIduwanyuhmsskcplgyb92sm">
         <w:r>
           <w:rPr>
             <w:rFonts w:ascii="Calibri" w:cs="Calibri" w:eastAsia="Calibri" w:hAnsi="Calibri"/>
@@ -2985,7 +3487,7 @@
             <w:szCs w:val="21"/>
             <w:u w:val="single"/>
           </w:rPr>
-          <w:t xml:space="preserve">Dice: Guild, Senior Data Governance Analyst (Remote, posted 2026-09-30)</w:t>
+          <w:t xml:space="preserve">Glassdoor 'salary' reviews</w:t>
         </w:r>
       </w:hyperlink>
       <w:r>
@@ -2995,7 +3497,7 @@
           <w:sz w:val="17"/>
           <w:szCs w:val="17"/>
         </w:rPr>
-        <w:t xml:space="preserve">  https://www.dice.com/job-detail/d07b5dfd-6444-4123-a7a8-f6fcdeb3fc2c?utm_source=claude-user&amp;utm_medium=mcp</w:t>
+        <w:t xml:space="preserve">  https://www.glassdoor.com/Reviews/Guild-Mortgage-salary-Reviews-EI_IE5605.0,14_KH15,21.htm</w:t>
       </w:r>
     </w:p>
     <w:p>
@@ -3007,7 +3509,7 @@
         </w:numPr>
         <w:spacing w:after="50" w:line="259"/>
       </w:pPr>
-      <w:hyperlink w:history="1" r:id="rIduobfuqjkw3qogwb7wrn84">
+      <w:hyperlink w:history="1" r:id="rIdjzgnjsrrn-d2lsh-ap99o">
         <w:r>
           <w:rPr>
             <w:rFonts w:ascii="Calibri" w:cs="Calibri" w:eastAsia="Calibri" w:hAnsi="Calibri"/>
@@ -3016,7 +3518,7 @@
             <w:szCs w:val="21"/>
             <w:u w:val="single"/>
           </w:rPr>
-          <w:t xml:space="preserve">Dice: Guild, Sr Data Analyst (Remote, posted 2026-09-23)</w:t>
+          <w:t xml:space="preserve">Glassdoor Q&amp;A - job security</w:t>
         </w:r>
       </w:hyperlink>
       <w:r>
@@ -3026,7 +3528,7 @@
           <w:sz w:val="17"/>
           <w:szCs w:val="17"/>
         </w:rPr>
-        <w:t xml:space="preserve">  https://www.dice.com/job-detail/582f5f2e-8b75-4454-a967-2aff2ec86ac5?utm_source=claude-user&amp;utm_medium=mcp</w:t>
+        <w:t xml:space="preserve">  https://www.glassdoor.com/FAQ/Guild-Mortgage-Question-FAQ200049-E5605.htm</w:t>
       </w:r>
     </w:p>
     <w:p>
@@ -3038,7 +3540,7 @@
         </w:numPr>
         <w:spacing w:after="50" w:line="259"/>
       </w:pPr>
-      <w:hyperlink w:history="1" r:id="rIdelr7ym-r1ab6wt_tovbu1">
+      <w:hyperlink w:history="1" r:id="rIdsyk5lvopbxjlwjnfl2mrk">
         <w:r>
           <w:rPr>
             <w:rFonts w:ascii="Calibri" w:cs="Calibri" w:eastAsia="Calibri" w:hAnsi="Calibri"/>
@@ -3047,7 +3549,7 @@
             <w:szCs w:val="21"/>
             <w:u w:val="single"/>
           </w:rPr>
-          <w:t xml:space="preserve">Dice: Guild, Sr System Administrator - Microsoft Platforms (Remote, posted 2026-09-24)</w:t>
+          <w:t xml:space="preserve">Glassdoor San Diego reviews</w:t>
         </w:r>
       </w:hyperlink>
       <w:r>
@@ -3057,7 +3559,7 @@
           <w:sz w:val="17"/>
           <w:szCs w:val="17"/>
         </w:rPr>
-        <w:t xml:space="preserve">  https://www.dice.com/job-detail/973e34a6-d161-4f21-9620-9fa7b34428a7?utm_source=claude-user&amp;utm_medium=mcp</w:t>
+        <w:t xml:space="preserve">  https://www.glassdoor.com/Reviews/Guild-Mortgage-San-Diego-Reviews-EI_IE5605.0,14_IL.15,24_IM758.htm</w:t>
       </w:r>
     </w:p>
     <w:p>
@@ -3069,7 +3571,7 @@
         </w:numPr>
         <w:spacing w:after="50" w:line="259"/>
       </w:pPr>
-      <w:hyperlink w:history="1" r:id="rIddo9cikwocewwz8uzv2epj">
+      <w:hyperlink w:history="1" r:id="rIdmps6krwjiaz6krpx1vh6i">
         <w:r>
           <w:rPr>
             <w:rFonts w:ascii="Calibri" w:cs="Calibri" w:eastAsia="Calibri" w:hAnsi="Calibri"/>
@@ -3078,7 +3580,7 @@
             <w:szCs w:val="21"/>
             <w:u w:val="single"/>
           </w:rPr>
-          <w:t xml:space="preserve">Dice: Guild, Manager IT QA (Remote, posted 2026-09-24)</w:t>
+          <w:t xml:space="preserve">Indeed reviews - Guild Mortgage Company LLC (about 440)</w:t>
         </w:r>
       </w:hyperlink>
       <w:r>
@@ -3088,7 +3590,7 @@
           <w:sz w:val="17"/>
           <w:szCs w:val="17"/>
         </w:rPr>
-        <w:t xml:space="preserve">  https://www.dice.com/job-detail/519d14bb-f570-46ca-8dd3-b59f6cc1b303?utm_source=claude-user&amp;utm_medium=mcp</w:t>
+        <w:t xml:space="preserve">  https://www.indeed.com/cmp/Guild-Mortgage-Company-LLC/reviews</w:t>
       </w:r>
     </w:p>
     <w:p>
@@ -3100,7 +3602,7 @@
         </w:numPr>
         <w:spacing w:after="50" w:line="259"/>
       </w:pPr>
-      <w:hyperlink w:history="1" r:id="rId4o7uyvqrtls26ilsc3gg0">
+      <w:hyperlink w:history="1" r:id="rIdnnpqqk8nrkplw2b4lhfpy">
         <w:r>
           <w:rPr>
             <w:rFonts w:ascii="Calibri" w:cs="Calibri" w:eastAsia="Calibri" w:hAnsi="Calibri"/>
@@ -3109,7 +3611,7 @@
             <w:szCs w:val="21"/>
             <w:u w:val="single"/>
           </w:rPr>
-          <w:t xml:space="preserve">Dice: Guild, VP Chief Information Security Officer (Remote, posted 2026-09-14)</w:t>
+          <w:t xml:space="preserve">Indeed reviews - Phoenix, AZ filter</w:t>
         </w:r>
       </w:hyperlink>
       <w:r>
@@ -3119,7 +3621,937 @@
           <w:sz w:val="17"/>
           <w:szCs w:val="17"/>
         </w:rPr>
-        <w:t xml:space="preserve">  https://www.dice.com/job-detail/1de1591d-6317-4d58-a579-630b7c0d27fc?utm_source=claude-user&amp;utm_medium=mcp</w:t>
+        <w:t xml:space="preserve">  https://www.indeed.com/cmp/Guild-Mortgage-Company-LLC/reviews?fcountry=US&amp;floc=Phoenix,+AZ</w:t>
+      </w:r>
+    </w:p>
+    <w:p>
+      <w:pPr>
+        <w:pStyle w:val="ListParagraph"/>
+        <w:numPr>
+          <w:ilvl w:val="0"/>
+          <w:numId w:val="3"/>
+        </w:numPr>
+        <w:spacing w:after="50" w:line="259"/>
+      </w:pPr>
+      <w:hyperlink w:history="1" r:id="rIdywashikjmlnpvbk4blvxb">
+        <w:r>
+          <w:rPr>
+            <w:rFonts w:ascii="Calibri" w:cs="Calibri" w:eastAsia="Calibri" w:hAnsi="Calibri"/>
+            <w:color w:val="1A4D8F"/>
+            <w:sz w:val="21"/>
+            <w:szCs w:val="21"/>
+            <w:u w:val="single"/>
+          </w:rPr>
+          <w:t xml:space="preserve">Indeed reviews - training keyword</w:t>
+        </w:r>
+      </w:hyperlink>
+      <w:r>
+        <w:rPr>
+          <w:rFonts w:ascii="Calibri" w:cs="Calibri" w:eastAsia="Calibri" w:hAnsi="Calibri"/>
+          <w:color w:val="777777"/>
+          <w:sz w:val="17"/>
+          <w:szCs w:val="17"/>
+        </w:rPr>
+        <w:t xml:space="preserve">  https://www.indeed.com/cmp/Guild-Mortgage-Company-LLC/reviews?ftext=training&amp;start=20</w:t>
+      </w:r>
+    </w:p>
+    <w:p>
+      <w:pPr>
+        <w:pStyle w:val="ListParagraph"/>
+        <w:numPr>
+          <w:ilvl w:val="0"/>
+          <w:numId w:val="3"/>
+        </w:numPr>
+        <w:spacing w:after="50" w:line="259"/>
+      </w:pPr>
+      <w:hyperlink w:history="1" r:id="rIdtex6no7deznlb0thcrrh8">
+        <w:r>
+          <w:rPr>
+            <w:rFonts w:ascii="Calibri" w:cs="Calibri" w:eastAsia="Calibri" w:hAnsi="Calibri"/>
+            <w:color w:val="1A4D8F"/>
+            <w:sz w:val="21"/>
+            <w:szCs w:val="21"/>
+            <w:u w:val="single"/>
+          </w:rPr>
+          <w:t xml:space="preserve">Indeed reviews - management topic (Guild-Mortgage listing)</w:t>
+        </w:r>
+      </w:hyperlink>
+      <w:r>
+        <w:rPr>
+          <w:rFonts w:ascii="Calibri" w:cs="Calibri" w:eastAsia="Calibri" w:hAnsi="Calibri"/>
+          <w:color w:val="777777"/>
+          <w:sz w:val="17"/>
+          <w:szCs w:val="17"/>
+        </w:rPr>
+        <w:t xml:space="preserve">  https://www.indeed.com/cmp/Guild-Mortgage/reviews?ftopic=mgmt</w:t>
+      </w:r>
+    </w:p>
+    <w:p>
+      <w:pPr>
+        <w:pStyle w:val="ListParagraph"/>
+        <w:numPr>
+          <w:ilvl w:val="0"/>
+          <w:numId w:val="3"/>
+        </w:numPr>
+        <w:spacing w:after="50" w:line="259"/>
+      </w:pPr>
+      <w:hyperlink w:history="1" r:id="rIdmmmlx15dgez6eebllg9rl">
+        <w:r>
+          <w:rPr>
+            <w:rFonts w:ascii="Calibri" w:cs="Calibri" w:eastAsia="Calibri" w:hAnsi="Calibri"/>
+            <w:color w:val="1A4D8F"/>
+            <w:sz w:val="21"/>
+            <w:szCs w:val="21"/>
+            <w:u w:val="single"/>
+          </w:rPr>
+          <w:t xml:space="preserve">Indeed reviews - Loan Processor</w:t>
+        </w:r>
+      </w:hyperlink>
+      <w:r>
+        <w:rPr>
+          <w:rFonts w:ascii="Calibri" w:cs="Calibri" w:eastAsia="Calibri" w:hAnsi="Calibri"/>
+          <w:color w:val="777777"/>
+          <w:sz w:val="17"/>
+          <w:szCs w:val="17"/>
+        </w:rPr>
+        <w:t xml:space="preserve">  https://www.indeed.com/cmp/Guild-Mortgage-Company-LLC/reviews?fjobtitle=Loan+Processor</w:t>
+      </w:r>
+    </w:p>
+    <w:p>
+      <w:pPr>
+        <w:pStyle w:val="ListParagraph"/>
+        <w:numPr>
+          <w:ilvl w:val="0"/>
+          <w:numId w:val="3"/>
+        </w:numPr>
+        <w:spacing w:after="50" w:line="259"/>
+      </w:pPr>
+      <w:hyperlink w:history="1" r:id="rIdfugae_lxyc_g1panumdqd">
+        <w:r>
+          <w:rPr>
+            <w:rFonts w:ascii="Calibri" w:cs="Calibri" w:eastAsia="Calibri" w:hAnsi="Calibri"/>
+            <w:color w:val="1A4D8F"/>
+            <w:sz w:val="21"/>
+            <w:szCs w:val="21"/>
+            <w:u w:val="single"/>
+          </w:rPr>
+          <w:t xml:space="preserve">Indeed reviews - Loan Officer</w:t>
+        </w:r>
+      </w:hyperlink>
+      <w:r>
+        <w:rPr>
+          <w:rFonts w:ascii="Calibri" w:cs="Calibri" w:eastAsia="Calibri" w:hAnsi="Calibri"/>
+          <w:color w:val="777777"/>
+          <w:sz w:val="17"/>
+          <w:szCs w:val="17"/>
+        </w:rPr>
+        <w:t xml:space="preserve">  https://www.indeed.com/cmp/Guild-Mortgage-Company-LLC/reviews?fjobtitle=Loan+Officer</w:t>
+      </w:r>
+    </w:p>
+    <w:p>
+      <w:pPr>
+        <w:pStyle w:val="ListParagraph"/>
+        <w:numPr>
+          <w:ilvl w:val="0"/>
+          <w:numId w:val="3"/>
+        </w:numPr>
+        <w:spacing w:after="50" w:line="259"/>
+      </w:pPr>
+      <w:hyperlink w:history="1" r:id="rIdzoxsiqdu-kwa6wxzx-k9j">
+        <w:r>
+          <w:rPr>
+            <w:rFonts w:ascii="Calibri" w:cs="Calibri" w:eastAsia="Calibri" w:hAnsi="Calibri"/>
+            <w:color w:val="1A4D8F"/>
+            <w:sz w:val="21"/>
+            <w:szCs w:val="21"/>
+            <w:u w:val="single"/>
+          </w:rPr>
+          <w:t xml:space="preserve">Blind - Guild Mortgage reviews (1 review)</w:t>
+        </w:r>
+      </w:hyperlink>
+      <w:r>
+        <w:rPr>
+          <w:rFonts w:ascii="Calibri" w:cs="Calibri" w:eastAsia="Calibri" w:hAnsi="Calibri"/>
+          <w:color w:val="777777"/>
+          <w:sz w:val="17"/>
+          <w:szCs w:val="17"/>
+        </w:rPr>
+        <w:t xml:space="preserve">  https://www.teamblind.com/company/Guild-Mortgage/reviews</w:t>
+      </w:r>
+    </w:p>
+    <w:p>
+      <w:pPr>
+        <w:pStyle w:val="ListParagraph"/>
+        <w:numPr>
+          <w:ilvl w:val="0"/>
+          <w:numId w:val="3"/>
+        </w:numPr>
+        <w:spacing w:after="50" w:line="259"/>
+      </w:pPr>
+      <w:hyperlink w:history="1" r:id="rIdiywihtviyg353teyhoip5">
+        <w:r>
+          <w:rPr>
+            <w:rFonts w:ascii="Calibri" w:cs="Calibri" w:eastAsia="Calibri" w:hAnsi="Calibri"/>
+            <w:color w:val="1A4D8F"/>
+            <w:sz w:val="21"/>
+            <w:szCs w:val="21"/>
+            <w:u w:val="single"/>
+          </w:rPr>
+          <w:t xml:space="preserve">Comparably - Guild Mortgage culture</w:t>
+        </w:r>
+      </w:hyperlink>
+      <w:r>
+        <w:rPr>
+          <w:rFonts w:ascii="Calibri" w:cs="Calibri" w:eastAsia="Calibri" w:hAnsi="Calibri"/>
+          <w:color w:val="777777"/>
+          <w:sz w:val="17"/>
+          <w:szCs w:val="17"/>
+        </w:rPr>
+        <w:t xml:space="preserve">  https://www.comparably.com/companies/guild-mortgage?open=claim</w:t>
+      </w:r>
+    </w:p>
+    <w:p>
+      <w:pPr>
+        <w:pStyle w:val="ListParagraph"/>
+        <w:numPr>
+          <w:ilvl w:val="0"/>
+          <w:numId w:val="3"/>
+        </w:numPr>
+        <w:spacing w:after="50" w:line="259"/>
+      </w:pPr>
+      <w:hyperlink w:history="1" r:id="rIdw6vmf68alpgqgnbahqr8o">
+        <w:r>
+          <w:rPr>
+            <w:rFonts w:ascii="Calibri" w:cs="Calibri" w:eastAsia="Calibri" w:hAnsi="Calibri"/>
+            <w:color w:val="1A4D8F"/>
+            <w:sz w:val="21"/>
+            <w:szCs w:val="21"/>
+            <w:u w:val="single"/>
+          </w:rPr>
+          <w:t xml:space="preserve">Comparably - Guild Mortgage (static mirror)</w:t>
+        </w:r>
+      </w:hyperlink>
+      <w:r>
+        <w:rPr>
+          <w:rFonts w:ascii="Calibri" w:cs="Calibri" w:eastAsia="Calibri" w:hAnsi="Calibri"/>
+          <w:color w:val="777777"/>
+          <w:sz w:val="17"/>
+          <w:szCs w:val="17"/>
+        </w:rPr>
+        <w:t xml:space="preserve">  https://a3-static.comparably.com/companies/guild-mortgage</w:t>
+      </w:r>
+    </w:p>
+    <w:p>
+      <w:pPr>
+        <w:pStyle w:val="ListParagraph"/>
+        <w:numPr>
+          <w:ilvl w:val="0"/>
+          <w:numId w:val="3"/>
+        </w:numPr>
+        <w:spacing w:after="50" w:line="259"/>
+      </w:pPr>
+      <w:hyperlink w:history="1" r:id="rIdxmmikist1lrwt27yae9b-">
+        <w:r>
+          <w:rPr>
+            <w:rFonts w:ascii="Calibri" w:cs="Calibri" w:eastAsia="Calibri" w:hAnsi="Calibri"/>
+            <w:color w:val="1A4D8F"/>
+            <w:sz w:val="21"/>
+            <w:szCs w:val="21"/>
+            <w:u w:val="single"/>
+          </w:rPr>
+          <w:t xml:space="preserve">CareerBliss - Guild Mortgage reviews</w:t>
+        </w:r>
+      </w:hyperlink>
+      <w:r>
+        <w:rPr>
+          <w:rFonts w:ascii="Calibri" w:cs="Calibri" w:eastAsia="Calibri" w:hAnsi="Calibri"/>
+          <w:color w:val="777777"/>
+          <w:sz w:val="17"/>
+          <w:szCs w:val="17"/>
+        </w:rPr>
+        <w:t xml:space="preserve">  https://www.careerbliss.com/guild-mortgage/reviews</w:t>
+      </w:r>
+    </w:p>
+    <w:p>
+      <w:pPr>
+        <w:pStyle w:val="ListParagraph"/>
+        <w:numPr>
+          <w:ilvl w:val="0"/>
+          <w:numId w:val="3"/>
+        </w:numPr>
+        <w:spacing w:after="50" w:line="259"/>
+      </w:pPr>
+      <w:hyperlink w:history="1" r:id="rIdrjflmdo7mpj68qfayco_z">
+        <w:r>
+          <w:rPr>
+            <w:rFonts w:ascii="Calibri" w:cs="Calibri" w:eastAsia="Calibri" w:hAnsi="Calibri"/>
+            <w:color w:val="1A4D8F"/>
+            <w:sz w:val="21"/>
+            <w:szCs w:val="21"/>
+            <w:u w:val="single"/>
+          </w:rPr>
+          <w:t xml:space="preserve">PayScale - Guild Mortgage pay</w:t>
+        </w:r>
+      </w:hyperlink>
+      <w:r>
+        <w:rPr>
+          <w:rFonts w:ascii="Calibri" w:cs="Calibri" w:eastAsia="Calibri" w:hAnsi="Calibri"/>
+          <w:color w:val="777777"/>
+          <w:sz w:val="17"/>
+          <w:szCs w:val="17"/>
+        </w:rPr>
+        <w:t xml:space="preserve">  https://www.payscale.com/research/US/Employer=Guild_Mortgage_Company/Hourly_Rate</w:t>
+      </w:r>
+    </w:p>
+    <w:p>
+      <w:pPr>
+        <w:pStyle w:val="ListParagraph"/>
+        <w:numPr>
+          <w:ilvl w:val="0"/>
+          <w:numId w:val="3"/>
+        </w:numPr>
+        <w:spacing w:after="50" w:line="259"/>
+      </w:pPr>
+      <w:hyperlink w:history="1" r:id="rIdq5y1snuvmidqoiqslicqz">
+        <w:r>
+          <w:rPr>
+            <w:rFonts w:ascii="Calibri" w:cs="Calibri" w:eastAsia="Calibri" w:hAnsi="Calibri"/>
+            <w:color w:val="1A4D8F"/>
+            <w:sz w:val="21"/>
+            <w:szCs w:val="21"/>
+            <w:u w:val="single"/>
+          </w:rPr>
+          <w:t xml:space="preserve">Revelio Labs - employee count</w:t>
+        </w:r>
+      </w:hyperlink>
+      <w:r>
+        <w:rPr>
+          <w:rFonts w:ascii="Calibri" w:cs="Calibri" w:eastAsia="Calibri" w:hAnsi="Calibri"/>
+          <w:color w:val="777777"/>
+          <w:sz w:val="17"/>
+          <w:szCs w:val="17"/>
+        </w:rPr>
+        <w:t xml:space="preserve">  https://www.reveliolabs.com/companies/guild-mortgage/employees/</w:t>
+      </w:r>
+    </w:p>
+    <w:p>
+      <w:pPr>
+        <w:pStyle w:val="ListParagraph"/>
+        <w:numPr>
+          <w:ilvl w:val="0"/>
+          <w:numId w:val="3"/>
+        </w:numPr>
+        <w:spacing w:after="50" w:line="259"/>
+      </w:pPr>
+      <w:hyperlink w:history="1" r:id="rIdmnwydp0iff4wfyr4jnsnn">
+        <w:r>
+          <w:rPr>
+            <w:rFonts w:ascii="Calibri" w:cs="Calibri" w:eastAsia="Calibri" w:hAnsi="Calibri"/>
+            <w:color w:val="1A4D8F"/>
+            <w:sz w:val="21"/>
+            <w:szCs w:val="21"/>
+            <w:u w:val="single"/>
+          </w:rPr>
+          <w:t xml:space="preserve">Built In - AI Training &amp; Enablement Specialist posting</w:t>
+        </w:r>
+      </w:hyperlink>
+      <w:r>
+        <w:rPr>
+          <w:rFonts w:ascii="Calibri" w:cs="Calibri" w:eastAsia="Calibri" w:hAnsi="Calibri"/>
+          <w:color w:val="777777"/>
+          <w:sz w:val="17"/>
+          <w:szCs w:val="17"/>
+        </w:rPr>
+        <w:t xml:space="preserve">  https://www.builtinaustin.com/job/ai-training-enablement-specialist/11427378</w:t>
+      </w:r>
+    </w:p>
+    <w:p>
+      <w:pPr>
+        <w:pStyle w:val="ListParagraph"/>
+        <w:numPr>
+          <w:ilvl w:val="0"/>
+          <w:numId w:val="3"/>
+        </w:numPr>
+        <w:spacing w:after="50" w:line="259"/>
+      </w:pPr>
+      <w:hyperlink w:history="1" r:id="rIdrcdasejexvpi3paemjwzy">
+        <w:r>
+          <w:rPr>
+            <w:rFonts w:ascii="Calibri" w:cs="Calibri" w:eastAsia="Calibri" w:hAnsi="Calibri"/>
+            <w:color w:val="1A4D8F"/>
+            <w:sz w:val="21"/>
+            <w:szCs w:val="21"/>
+            <w:u w:val="single"/>
+          </w:rPr>
+          <w:t xml:space="preserve">Edtech.com - AI Training &amp; Enablement Specialist posting</w:t>
+        </w:r>
+      </w:hyperlink>
+      <w:r>
+        <w:rPr>
+          <w:rFonts w:ascii="Calibri" w:cs="Calibri" w:eastAsia="Calibri" w:hAnsi="Calibri"/>
+          <w:color w:val="777777"/>
+          <w:sz w:val="17"/>
+          <w:szCs w:val="17"/>
+        </w:rPr>
+        <w:t xml:space="preserve">  https://www.edtech.com/jobs/ai-training-enablement-specialist-76404</w:t>
+      </w:r>
+    </w:p>
+    <w:p>
+      <w:pPr>
+        <w:pStyle w:val="ListParagraph"/>
+        <w:numPr>
+          <w:ilvl w:val="0"/>
+          <w:numId w:val="3"/>
+        </w:numPr>
+        <w:spacing w:after="50" w:line="259"/>
+      </w:pPr>
+      <w:hyperlink w:history="1" r:id="rIdabuypojqqrfslblkezmbx">
+        <w:r>
+          <w:rPr>
+            <w:rFonts w:ascii="Calibri" w:cs="Calibri" w:eastAsia="Calibri" w:hAnsi="Calibri"/>
+            <w:color w:val="1A4D8F"/>
+            <w:sz w:val="21"/>
+            <w:szCs w:val="21"/>
+            <w:u w:val="single"/>
+          </w:rPr>
+          <w:t xml:space="preserve">Built In - Lead, AI Governance posting</w:t>
+        </w:r>
+      </w:hyperlink>
+      <w:r>
+        <w:rPr>
+          <w:rFonts w:ascii="Calibri" w:cs="Calibri" w:eastAsia="Calibri" w:hAnsi="Calibri"/>
+          <w:color w:val="777777"/>
+          <w:sz w:val="17"/>
+          <w:szCs w:val="17"/>
+        </w:rPr>
+        <w:t xml:space="preserve">  https://www.builtincolorado.com/job/lead-ai-governance/11005495</w:t>
+      </w:r>
+    </w:p>
+    <w:p>
+      <w:pPr>
+        <w:pStyle w:val="ListParagraph"/>
+        <w:numPr>
+          <w:ilvl w:val="0"/>
+          <w:numId w:val="3"/>
+        </w:numPr>
+        <w:spacing w:after="50" w:line="259"/>
+      </w:pPr>
+      <w:hyperlink w:history="1" r:id="rIdj5bxjme37ddjfm8eqodv5">
+        <w:r>
+          <w:rPr>
+            <w:rFonts w:ascii="Calibri" w:cs="Calibri" w:eastAsia="Calibri" w:hAnsi="Calibri"/>
+            <w:color w:val="1A4D8F"/>
+            <w:sz w:val="21"/>
+            <w:szCs w:val="21"/>
+            <w:u w:val="single"/>
+          </w:rPr>
+          <w:t xml:space="preserve">Built In - AI Engineer posting</w:t>
+        </w:r>
+      </w:hyperlink>
+      <w:r>
+        <w:rPr>
+          <w:rFonts w:ascii="Calibri" w:cs="Calibri" w:eastAsia="Calibri" w:hAnsi="Calibri"/>
+          <w:color w:val="777777"/>
+          <w:sz w:val="17"/>
+          <w:szCs w:val="17"/>
+        </w:rPr>
+        <w:t xml:space="preserve">  https://www.builtinaustin.com/job/ai-engineer/9706064</w:t>
+      </w:r>
+    </w:p>
+    <w:p>
+      <w:pPr>
+        <w:pStyle w:val="ListParagraph"/>
+        <w:numPr>
+          <w:ilvl w:val="0"/>
+          <w:numId w:val="3"/>
+        </w:numPr>
+        <w:spacing w:after="50" w:line="259"/>
+      </w:pPr>
+      <w:hyperlink w:history="1" r:id="rIdddah3bghvab0cpwvbofus">
+        <w:r>
+          <w:rPr>
+            <w:rFonts w:ascii="Calibri" w:cs="Calibri" w:eastAsia="Calibri" w:hAnsi="Calibri"/>
+            <w:color w:val="1A4D8F"/>
+            <w:sz w:val="21"/>
+            <w:szCs w:val="21"/>
+            <w:u w:val="single"/>
+          </w:rPr>
+          <w:t xml:space="preserve">Business Wire - GuildGPT launch (July 2024)</w:t>
+        </w:r>
+      </w:hyperlink>
+      <w:r>
+        <w:rPr>
+          <w:rFonts w:ascii="Calibri" w:cs="Calibri" w:eastAsia="Calibri" w:hAnsi="Calibri"/>
+          <w:color w:val="777777"/>
+          <w:sz w:val="17"/>
+          <w:szCs w:val="17"/>
+        </w:rPr>
+        <w:t xml:space="preserve">  https://www.businesswire.com/news/home/20240722906709/en</w:t>
+      </w:r>
+    </w:p>
+    <w:p>
+      <w:pPr>
+        <w:pStyle w:val="ListParagraph"/>
+        <w:numPr>
+          <w:ilvl w:val="0"/>
+          <w:numId w:val="3"/>
+        </w:numPr>
+        <w:spacing w:after="50" w:line="259"/>
+      </w:pPr>
+      <w:hyperlink w:history="1" r:id="rId6b6xe5jalcfczwz63y7f7">
+        <w:r>
+          <w:rPr>
+            <w:rFonts w:ascii="Calibri" w:cs="Calibri" w:eastAsia="Calibri" w:hAnsi="Calibri"/>
+            <w:color w:val="1A4D8F"/>
+            <w:sz w:val="21"/>
+            <w:szCs w:val="21"/>
+            <w:u w:val="single"/>
+          </w:rPr>
+          <w:t xml:space="preserve">Nasdaq - Guild launches custom AI system</w:t>
+        </w:r>
+      </w:hyperlink>
+      <w:r>
+        <w:rPr>
+          <w:rFonts w:ascii="Calibri" w:cs="Calibri" w:eastAsia="Calibri" w:hAnsi="Calibri"/>
+          <w:color w:val="777777"/>
+          <w:sz w:val="17"/>
+          <w:szCs w:val="17"/>
+        </w:rPr>
+        <w:t xml:space="preserve">  https://www.nasdaq.com/press-release/guild-mortgage-launches-custom-ai-system-streamlining-tasks-and-improving-efficiency</w:t>
+      </w:r>
+    </w:p>
+    <w:p>
+      <w:pPr>
+        <w:pStyle w:val="ListParagraph"/>
+        <w:numPr>
+          <w:ilvl w:val="0"/>
+          <w:numId w:val="3"/>
+        </w:numPr>
+        <w:spacing w:after="50" w:line="259"/>
+      </w:pPr>
+      <w:hyperlink w:history="1" r:id="rIdpdax_ikka5zdglyy5ukpm">
+        <w:r>
+          <w:rPr>
+            <w:rFonts w:ascii="Calibri" w:cs="Calibri" w:eastAsia="Calibri" w:hAnsi="Calibri"/>
+            <w:color w:val="1A4D8F"/>
+            <w:sz w:val="21"/>
+            <w:szCs w:val="21"/>
+            <w:u w:val="single"/>
+          </w:rPr>
+          <w:t xml:space="preserve">Built In - Loss Mitigation Supervisor (remote/hybrid terms)</w:t>
+        </w:r>
+      </w:hyperlink>
+      <w:r>
+        <w:rPr>
+          <w:rFonts w:ascii="Calibri" w:cs="Calibri" w:eastAsia="Calibri" w:hAnsi="Calibri"/>
+          <w:color w:val="777777"/>
+          <w:sz w:val="17"/>
+          <w:szCs w:val="17"/>
+        </w:rPr>
+        <w:t xml:space="preserve">  https://www.builtinboston.com/job/loss-mitigation-supervisor/10971342</w:t>
+      </w:r>
+    </w:p>
+    <w:p>
+      <w:pPr>
+        <w:pStyle w:val="ListParagraph"/>
+        <w:numPr>
+          <w:ilvl w:val="0"/>
+          <w:numId w:val="3"/>
+        </w:numPr>
+        <w:spacing w:after="50" w:line="259"/>
+      </w:pPr>
+      <w:hyperlink w:history="1" r:id="rId-gahc8ecg1q4nlrs2gje7">
+        <w:r>
+          <w:rPr>
+            <w:rFonts w:ascii="Calibri" w:cs="Calibri" w:eastAsia="Calibri" w:hAnsi="Calibri"/>
+            <w:color w:val="1A4D8F"/>
+            <w:sz w:val="21"/>
+            <w:szCs w:val="21"/>
+            <w:u w:val="single"/>
+          </w:rPr>
+          <w:t xml:space="preserve">Remote Rocketship - Guild remote jobs</w:t>
+        </w:r>
+      </w:hyperlink>
+      <w:r>
+        <w:rPr>
+          <w:rFonts w:ascii="Calibri" w:cs="Calibri" w:eastAsia="Calibri" w:hAnsi="Calibri"/>
+          <w:color w:val="777777"/>
+          <w:sz w:val="17"/>
+          <w:szCs w:val="17"/>
+        </w:rPr>
+        <w:t xml:space="preserve">  https://www.remoterocketship.com/company/guildmortgage/</w:t>
+      </w:r>
+    </w:p>
+    <w:p>
+      <w:pPr>
+        <w:pStyle w:val="ListParagraph"/>
+        <w:numPr>
+          <w:ilvl w:val="0"/>
+          <w:numId w:val="3"/>
+        </w:numPr>
+        <w:spacing w:after="50" w:line="259"/>
+      </w:pPr>
+      <w:hyperlink w:history="1" r:id="rIdmw2rjn_nbkix0k14mkqr7">
+        <w:r>
+          <w:rPr>
+            <w:rFonts w:ascii="Calibri" w:cs="Calibri" w:eastAsia="Calibri" w:hAnsi="Calibri"/>
+            <w:color w:val="1A4D8F"/>
+            <w:sz w:val="21"/>
+            <w:szCs w:val="21"/>
+            <w:u w:val="single"/>
+          </w:rPr>
+          <w:t xml:space="preserve">Flex Index - Guild flex work policy (AI-generated, unverified)</w:t>
+        </w:r>
+      </w:hyperlink>
+      <w:r>
+        <w:rPr>
+          <w:rFonts w:ascii="Calibri" w:cs="Calibri" w:eastAsia="Calibri" w:hAnsi="Calibri"/>
+          <w:color w:val="777777"/>
+          <w:sz w:val="17"/>
+          <w:szCs w:val="17"/>
+        </w:rPr>
+        <w:t xml:space="preserve">  https://flexindex.com/company/guildmortgage</w:t>
+      </w:r>
+    </w:p>
+    <w:p>
+      <w:pPr>
+        <w:pStyle w:val="ListParagraph"/>
+        <w:numPr>
+          <w:ilvl w:val="0"/>
+          <w:numId w:val="3"/>
+        </w:numPr>
+        <w:spacing w:after="50" w:line="259"/>
+      </w:pPr>
+      <w:hyperlink w:history="1" r:id="rIdldatvf22we4y8helmdsbm">
+        <w:r>
+          <w:rPr>
+            <w:rFonts w:ascii="Calibri" w:cs="Calibri" w:eastAsia="Calibri" w:hAnsi="Calibri"/>
+            <w:color w:val="1A4D8F"/>
+            <w:sz w:val="21"/>
+            <w:szCs w:val="21"/>
+            <w:u w:val="single"/>
+          </w:rPr>
+          <w:t xml:space="preserve">HousingWire - Bayview closes acquisition of Guild</w:t>
+        </w:r>
+      </w:hyperlink>
+      <w:r>
+        <w:rPr>
+          <w:rFonts w:ascii="Calibri" w:cs="Calibri" w:eastAsia="Calibri" w:hAnsi="Calibri"/>
+          <w:color w:val="777777"/>
+          <w:sz w:val="17"/>
+          <w:szCs w:val="17"/>
+        </w:rPr>
+        <w:t xml:space="preserve">  https://www.housingwire.com/articles/bayview-closes-acquisition-of-guild-taking-lender-private/</w:t>
+      </w:r>
+    </w:p>
+    <w:p>
+      <w:pPr>
+        <w:pStyle w:val="ListParagraph"/>
+        <w:numPr>
+          <w:ilvl w:val="0"/>
+          <w:numId w:val="3"/>
+        </w:numPr>
+        <w:spacing w:after="50" w:line="259"/>
+      </w:pPr>
+      <w:hyperlink w:history="1" r:id="rIdk8ikcd4lhqpefgkqbdycb">
+        <w:r>
+          <w:rPr>
+            <w:rFonts w:ascii="Calibri" w:cs="Calibri" w:eastAsia="Calibri" w:hAnsi="Calibri"/>
+            <w:color w:val="1A4D8F"/>
+            <w:sz w:val="21"/>
+            <w:szCs w:val="21"/>
+            <w:u w:val="single"/>
+          </w:rPr>
+          <w:t xml:space="preserve">SDBJ - Guild acquired by Bayview</w:t>
+        </w:r>
+      </w:hyperlink>
+      <w:r>
+        <w:rPr>
+          <w:rFonts w:ascii="Calibri" w:cs="Calibri" w:eastAsia="Calibri" w:hAnsi="Calibri"/>
+          <w:color w:val="777777"/>
+          <w:sz w:val="17"/>
+          <w:szCs w:val="17"/>
+        </w:rPr>
+        <w:t xml:space="preserve">  https://www.sdbj.com/finance/mortgage-lending/guild-mortgage-acquired-by-bayview-asset-management/</w:t>
+      </w:r>
+    </w:p>
+    <w:p>
+      <w:pPr>
+        <w:pStyle w:val="ListParagraph"/>
+        <w:numPr>
+          <w:ilvl w:val="0"/>
+          <w:numId w:val="3"/>
+        </w:numPr>
+        <w:spacing w:after="50" w:line="259"/>
+      </w:pPr>
+      <w:hyperlink w:history="1" r:id="rIdvc3l4dx0ukmnyj3a5zbc-">
+        <w:r>
+          <w:rPr>
+            <w:rFonts w:ascii="Calibri" w:cs="Calibri" w:eastAsia="Calibri" w:hAnsi="Calibri"/>
+            <w:color w:val="1A4D8F"/>
+            <w:sz w:val="21"/>
+            <w:szCs w:val="21"/>
+            <w:u w:val="single"/>
+          </w:rPr>
+          <w:t xml:space="preserve">NMP - Bayview closes acquisition of Guild</w:t>
+        </w:r>
+      </w:hyperlink>
+      <w:r>
+        <w:rPr>
+          <w:rFonts w:ascii="Calibri" w:cs="Calibri" w:eastAsia="Calibri" w:hAnsi="Calibri"/>
+          <w:color w:val="777777"/>
+          <w:sz w:val="17"/>
+          <w:szCs w:val="17"/>
+        </w:rPr>
+        <w:t xml:space="preserve">  https://nationalmortgageprofessional.com/news/bayview-closes-acquisition-guild</w:t>
+      </w:r>
+    </w:p>
+    <w:p>
+      <w:pPr>
+        <w:pStyle w:val="ListParagraph"/>
+        <w:numPr>
+          <w:ilvl w:val="0"/>
+          <w:numId w:val="3"/>
+        </w:numPr>
+        <w:spacing w:after="50" w:line="259"/>
+      </w:pPr>
+      <w:hyperlink w:history="1" r:id="rIdmqyci11lsk7lurwppd0zl">
+        <w:r>
+          <w:rPr>
+            <w:rFonts w:ascii="Calibri" w:cs="Calibri" w:eastAsia="Calibri" w:hAnsi="Calibri"/>
+            <w:color w:val="1A4D8F"/>
+            <w:sz w:val="21"/>
+            <w:szCs w:val="21"/>
+            <w:u w:val="single"/>
+          </w:rPr>
+          <w:t xml:space="preserve">National Mortgage News - Guild trims payroll (2022)</w:t>
+        </w:r>
+      </w:hyperlink>
+      <w:r>
+        <w:rPr>
+          <w:rFonts w:ascii="Calibri" w:cs="Calibri" w:eastAsia="Calibri" w:hAnsi="Calibri"/>
+          <w:color w:val="777777"/>
+          <w:sz w:val="17"/>
+          <w:szCs w:val="17"/>
+        </w:rPr>
+        <w:t xml:space="preserve">  https://nationalmortgagenews.com/news/guild-trims-payroll-as-origination-servicing-profits-dive</w:t>
+      </w:r>
+    </w:p>
+    <w:p>
+      <w:pPr>
+        <w:pStyle w:val="ListParagraph"/>
+        <w:numPr>
+          <w:ilvl w:val="0"/>
+          <w:numId w:val="3"/>
+        </w:numPr>
+        <w:spacing w:after="50" w:line="259"/>
+      </w:pPr>
+      <w:hyperlink w:history="1" r:id="rIdnqi4p2jwrznb9vgfub7kw">
+        <w:r>
+          <w:rPr>
+            <w:rFonts w:ascii="Calibri" w:cs="Calibri" w:eastAsia="Calibri" w:hAnsi="Calibri"/>
+            <w:color w:val="1A4D8F"/>
+            <w:sz w:val="21"/>
+            <w:szCs w:val="21"/>
+            <w:u w:val="single"/>
+          </w:rPr>
+          <w:t xml:space="preserve">HousingWire - Guild profits falter Q2 2022</w:t>
+        </w:r>
+      </w:hyperlink>
+      <w:r>
+        <w:rPr>
+          <w:rFonts w:ascii="Calibri" w:cs="Calibri" w:eastAsia="Calibri" w:hAnsi="Calibri"/>
+          <w:color w:val="777777"/>
+          <w:sz w:val="17"/>
+          <w:szCs w:val="17"/>
+        </w:rPr>
+        <w:t xml:space="preserve">  https://www.housingwire.com/articles/guild-still-eyeing-acquisitions-as-profits-falter-in-q2-2022/</w:t>
+      </w:r>
+    </w:p>
+    <w:p>
+      <w:pPr>
+        <w:pStyle w:val="ListParagraph"/>
+        <w:numPr>
+          <w:ilvl w:val="0"/>
+          <w:numId w:val="3"/>
+        </w:numPr>
+        <w:spacing w:after="50" w:line="259"/>
+      </w:pPr>
+      <w:hyperlink w:history="1" r:id="rIdclksn6vwnhiwu_oxpcd9h">
+        <w:r>
+          <w:rPr>
+            <w:rFonts w:ascii="Calibri" w:cs="Calibri" w:eastAsia="Calibri" w:hAnsi="Calibri"/>
+            <w:color w:val="1A4D8F"/>
+            <w:sz w:val="21"/>
+            <w:szCs w:val="21"/>
+            <w:u w:val="single"/>
+          </w:rPr>
+          <w:t xml:space="preserve">HousingWire - Academy Mortgage acquisition details</w:t>
+        </w:r>
+      </w:hyperlink>
+      <w:r>
+        <w:rPr>
+          <w:rFonts w:ascii="Calibri" w:cs="Calibri" w:eastAsia="Calibri" w:hAnsi="Calibri"/>
+          <w:color w:val="777777"/>
+          <w:sz w:val="17"/>
+          <w:szCs w:val="17"/>
+        </w:rPr>
+        <w:t xml:space="preserve">  https://housingwire.com/articles/guild-ceo-offers-details-on-academy-mortgage-acquisition</w:t>
+      </w:r>
+    </w:p>
+    <w:p>
+      <w:pPr>
+        <w:pStyle w:val="ListParagraph"/>
+        <w:numPr>
+          <w:ilvl w:val="0"/>
+          <w:numId w:val="3"/>
+        </w:numPr>
+        <w:spacing w:after="50" w:line="259"/>
+      </w:pPr>
+      <w:hyperlink w:history="1" r:id="rIdw6u4zrghyk3qwwuvzqnsr">
+        <w:r>
+          <w:rPr>
+            <w:rFonts w:ascii="Calibri" w:cs="Calibri" w:eastAsia="Calibri" w:hAnsi="Calibri"/>
+            <w:color w:val="1A4D8F"/>
+            <w:sz w:val="21"/>
+            <w:szCs w:val="21"/>
+            <w:u w:val="single"/>
+          </w:rPr>
+          <w:t xml:space="preserve">HousingWire - $10.7M award against ex-employees</w:t>
+        </w:r>
+      </w:hyperlink>
+      <w:r>
+        <w:rPr>
+          <w:rFonts w:ascii="Calibri" w:cs="Calibri" w:eastAsia="Calibri" w:hAnsi="Calibri"/>
+          <w:color w:val="777777"/>
+          <w:sz w:val="17"/>
+          <w:szCs w:val="17"/>
+        </w:rPr>
+        <w:t xml:space="preserve">  https://www.housingwire.com/articles/guild-asks-judge-to-confirm-10-7m-award-in-poaching-dispute-against-ex-employees/</w:t>
+      </w:r>
+    </w:p>
+    <w:p>
+      <w:pPr>
+        <w:pStyle w:val="ListParagraph"/>
+        <w:numPr>
+          <w:ilvl w:val="0"/>
+          <w:numId w:val="3"/>
+        </w:numPr>
+        <w:spacing w:after="50" w:line="259"/>
+      </w:pPr>
+      <w:hyperlink w:history="1" r:id="rIdtr1ktmgupxvkp-32uwixb">
+        <w:r>
+          <w:rPr>
+            <w:rFonts w:ascii="Calibri" w:cs="Calibri" w:eastAsia="Calibri" w:hAnsi="Calibri"/>
+            <w:color w:val="1A4D8F"/>
+            <w:sz w:val="21"/>
+            <w:szCs w:val="21"/>
+            <w:u w:val="single"/>
+          </w:rPr>
+          <w:t xml:space="preserve">HousingWire - Former executive sues over $750K</w:t>
+        </w:r>
+      </w:hyperlink>
+      <w:r>
+        <w:rPr>
+          <w:rFonts w:ascii="Calibri" w:cs="Calibri" w:eastAsia="Calibri" w:hAnsi="Calibri"/>
+          <w:color w:val="777777"/>
+          <w:sz w:val="17"/>
+          <w:szCs w:val="17"/>
+        </w:rPr>
+        <w:t xml:space="preserve">  https://www.housingwire.com/articles/former-executive-sues-guild-over-750000-in-unpaid-compensation/</w:t>
+      </w:r>
+    </w:p>
+    <w:p>
+      <w:pPr>
+        <w:pStyle w:val="ListParagraph"/>
+        <w:numPr>
+          <w:ilvl w:val="0"/>
+          <w:numId w:val="3"/>
+        </w:numPr>
+        <w:spacing w:after="50" w:line="259"/>
+      </w:pPr>
+      <w:hyperlink w:history="1" r:id="rId8zzqt6lchni0uzqgbrsjx">
+        <w:r>
+          <w:rPr>
+            <w:rFonts w:ascii="Calibri" w:cs="Calibri" w:eastAsia="Calibri" w:hAnsi="Calibri"/>
+            <w:color w:val="1A4D8F"/>
+            <w:sz w:val="21"/>
+            <w:szCs w:val="21"/>
+            <w:u w:val="single"/>
+          </w:rPr>
+          <w:t xml:space="preserve">National Mortgage News - Former exec wrongful termination suit</w:t>
+        </w:r>
+      </w:hyperlink>
+      <w:r>
+        <w:rPr>
+          <w:rFonts w:ascii="Calibri" w:cs="Calibri" w:eastAsia="Calibri" w:hAnsi="Calibri"/>
+          <w:color w:val="777777"/>
+          <w:sz w:val="17"/>
+          <w:szCs w:val="17"/>
+        </w:rPr>
+        <w:t xml:space="preserve">  https://www.nationalmortgagenews.com/news/former-guild-mortgage-exec-sues-over-wrongful-termination</w:t>
+      </w:r>
+    </w:p>
+    <w:p>
+      <w:pPr>
+        <w:pStyle w:val="ListParagraph"/>
+        <w:numPr>
+          <w:ilvl w:val="0"/>
+          <w:numId w:val="3"/>
+        </w:numPr>
+        <w:spacing w:after="50" w:line="259"/>
+      </w:pPr>
+      <w:hyperlink w:history="1" r:id="rId8m-nd32w-bpbbh4qzz7a5">
+        <w:r>
+          <w:rPr>
+            <w:rFonts w:ascii="Calibri" w:cs="Calibri" w:eastAsia="Calibri" w:hAnsi="Calibri"/>
+            <w:color w:val="1A4D8F"/>
+            <w:sz w:val="21"/>
+            <w:szCs w:val="21"/>
+            <w:u w:val="single"/>
+          </w:rPr>
+          <w:t xml:space="preserve">DOJ - Guild ~$25M FHA settlement</w:t>
+        </w:r>
+      </w:hyperlink>
+      <w:r>
+        <w:rPr>
+          <w:rFonts w:ascii="Calibri" w:cs="Calibri" w:eastAsia="Calibri" w:hAnsi="Calibri"/>
+          <w:color w:val="777777"/>
+          <w:sz w:val="17"/>
+          <w:szCs w:val="17"/>
+        </w:rPr>
+        <w:t xml:space="preserve">  https://www.justice.gov/usao-sdca/pr/guild-mortgage-company-san-diego-pay-almost-25-million-resolve-allegations-it-knowingly</w:t>
+      </w:r>
+    </w:p>
+    <w:p>
+      <w:pPr>
+        <w:pStyle w:val="ListParagraph"/>
+        <w:numPr>
+          <w:ilvl w:val="0"/>
+          <w:numId w:val="3"/>
+        </w:numPr>
+        <w:spacing w:after="50" w:line="259"/>
+      </w:pPr>
+      <w:hyperlink w:history="1" r:id="rId00hzjyvnd6ij2m_yp7dg6">
+        <w:r>
+          <w:rPr>
+            <w:rFonts w:ascii="Calibri" w:cs="Calibri" w:eastAsia="Calibri" w:hAnsi="Calibri"/>
+            <w:color w:val="1A4D8F"/>
+            <w:sz w:val="21"/>
+            <w:szCs w:val="21"/>
+            <w:u w:val="single"/>
+          </w:rPr>
+          <w:t xml:space="preserve">Guild Mortgage careers page</w:t>
+        </w:r>
+      </w:hyperlink>
+      <w:r>
+        <w:rPr>
+          <w:rFonts w:ascii="Calibri" w:cs="Calibri" w:eastAsia="Calibri" w:hAnsi="Calibri"/>
+          <w:color w:val="777777"/>
+          <w:sz w:val="17"/>
+          <w:szCs w:val="17"/>
+        </w:rPr>
+        <w:t xml:space="preserve">  https://www.guildmortgage.com/careers/</w:t>
       </w:r>
     </w:p>
     <w:sectPr>

</xml_diff>